<commit_message>
issue edits to templates
</commit_message>
<xml_diff>
--- a/docassemble/VTSuperiorCourtDebtAnswer/data/templates/superior_court_debt_answer.docx
+++ b/docassemble/VTSuperiorCourtDebtAnswer/data/templates/superior_court_debt_answer.docx
@@ -44,42 +44,70 @@
           <w:sz w:val="24"/>
           <w:szCs w:val="24"/>
         </w:rPr>
-        <w:t>include_docx_template</w:t>
-      </w:r>
-      <w:proofErr w:type="spellEnd"/>
+        <w:t>include_docx_</w:t>
+      </w:r>
+      <w:proofErr w:type="gramStart"/>
       <w:r>
         <w:rPr>
           <w:rFonts w:ascii="Times New Roman" w:eastAsia="Times New Roman" w:hAnsi="Times New Roman" w:cs="Times New Roman"/>
           <w:sz w:val="24"/>
           <w:szCs w:val="24"/>
         </w:rPr>
-        <w:t xml:space="preserve">('include_caption.docx', </w:t>
-      </w:r>
-      <w:proofErr w:type="spellStart"/>
+        <w:t>template</w:t>
+      </w:r>
+      <w:proofErr w:type="spellEnd"/>
       <w:r>
         <w:rPr>
           <w:rFonts w:ascii="Times New Roman" w:eastAsia="Times New Roman" w:hAnsi="Times New Roman" w:cs="Times New Roman"/>
           <w:sz w:val="24"/>
           <w:szCs w:val="24"/>
         </w:rPr>
-        <w:t>caption_title</w:t>
-      </w:r>
-      <w:proofErr w:type="spellEnd"/>
+        <w:t>(</w:t>
+      </w:r>
+      <w:proofErr w:type="gramEnd"/>
       <w:r>
         <w:rPr>
           <w:rFonts w:ascii="Times New Roman" w:eastAsia="Times New Roman" w:hAnsi="Times New Roman" w:cs="Times New Roman"/>
           <w:sz w:val="24"/>
           <w:szCs w:val="24"/>
         </w:rPr>
-        <w:t>=</w:t>
-      </w:r>
+        <w:t xml:space="preserve">'include_caption.docx', </w:t>
+      </w:r>
+      <w:proofErr w:type="spellStart"/>
       <w:r>
         <w:rPr>
           <w:rFonts w:ascii="Times New Roman" w:eastAsia="Times New Roman" w:hAnsi="Times New Roman" w:cs="Times New Roman"/>
           <w:sz w:val="24"/>
           <w:szCs w:val="24"/>
         </w:rPr>
-        <w:t>“Answer”</w:t>
+        <w:t>caption_title</w:t>
+      </w:r>
+      <w:proofErr w:type="spellEnd"/>
+      <w:proofErr w:type="gramStart"/>
+      <w:r>
+        <w:rPr>
+          <w:rFonts w:ascii="Times New Roman" w:eastAsia="Times New Roman" w:hAnsi="Times New Roman" w:cs="Times New Roman"/>
+          <w:sz w:val="24"/>
+          <w:szCs w:val="24"/>
+        </w:rPr>
+        <w:t>=</w:t>
+      </w:r>
+      <w:r>
+        <w:rPr>
+          <w:rFonts w:ascii="Times New Roman" w:eastAsia="Times New Roman" w:hAnsi="Times New Roman" w:cs="Times New Roman"/>
+          <w:sz w:val="24"/>
+          <w:szCs w:val="24"/>
+        </w:rPr>
+        <w:t>“</w:t>
+      </w:r>
+      <w:proofErr w:type="gramEnd"/>
+      <w:r>
+        <w:rPr>
+          <w:rFonts w:ascii="Times New Roman" w:eastAsia="Times New Roman" w:hAnsi="Times New Roman" w:cs="Times New Roman"/>
+          <w:sz w:val="24"/>
+          <w:szCs w:val="24"/>
+        </w:rPr>
+        <w:t>”</w:t>
       </w:r>
       <w:r>
         <w:rPr>
@@ -123,9 +151,6 @@
       <w:pPr>
         <w:pStyle w:val="BodyText"/>
       </w:pPr>
-      <w:r>
-        <w:t xml:space="preserve">  </w:t>
-      </w:r>
     </w:p>
     <w:p>
       <w:pPr>
@@ -243,11 +268,6 @@
       <w:pPr>
         <w:pStyle w:val="BodyText"/>
       </w:pPr>
-    </w:p>
-    <w:p>
-      <w:pPr>
-        <w:pStyle w:val="BodyText"/>
-      </w:pPr>
       <w:r>
         <w:t xml:space="preserve">{%p for response in </w:t>
       </w:r>
@@ -687,13 +707,7 @@
         <w:pStyle w:val="BodyText"/>
       </w:pPr>
       <w:r>
-        <w:t>{%</w:t>
-      </w:r>
-      <w:r>
-        <w:t>p</w:t>
-      </w:r>
-      <w:r>
-        <w:t xml:space="preserve"> </w:t>
+        <w:t xml:space="preserve">{%p </w:t>
       </w:r>
       <w:proofErr w:type="spellStart"/>
       <w:r>
@@ -743,10 +757,7 @@
       </w:r>
       <w:proofErr w:type="gramEnd"/>
       <w:r>
-        <w:t>))</w:t>
-      </w:r>
-      <w:r>
-        <w:t xml:space="preserve"> </w:t>
+        <w:t xml:space="preserve">)) </w:t>
       </w:r>
       <w:r>
         <w:t xml:space="preserve">&gt; 0 </w:t>
@@ -795,13 +806,7 @@
         </w:numPr>
       </w:pPr>
       <w:r>
-        <w:t xml:space="preserve">{%p for </w:t>
-      </w:r>
-      <w:r>
-        <w:t>defense</w:t>
-      </w:r>
-      <w:r>
-        <w:t xml:space="preserve"> in </w:t>
+        <w:t xml:space="preserve">{%p for defense in </w:t>
       </w:r>
       <w:proofErr w:type="spellStart"/>
       <w:proofErr w:type="gramStart"/>
@@ -872,14 +877,7 @@
         <w:outlineLvl w:val="0"/>
       </w:pPr>
       <w:r>
-        <w:lastRenderedPageBreak/>
-        <w:t>{%</w:t>
-      </w:r>
-      <w:r>
-        <w:t>p</w:t>
-      </w:r>
-      <w:r>
-        <w:t xml:space="preserve"> </w:t>
+        <w:t xml:space="preserve">{%p </w:t>
       </w:r>
       <w:proofErr w:type="spellStart"/>
       <w:r>
@@ -900,6 +898,7 @@
         <w:outlineLvl w:val="0"/>
       </w:pPr>
       <w:r>
+        <w:lastRenderedPageBreak/>
         <w:t xml:space="preserve">      </w:t>
       </w:r>
       <w:r>
@@ -965,19 +964,7 @@
         <w:t xml:space="preserve">      </w:t>
       </w:r>
       <w:r>
-        <w:t>{%</w:t>
-      </w:r>
-      <w:r>
-        <w:t>p</w:t>
-      </w:r>
-      <w:r>
-        <w:t xml:space="preserve"> end</w:t>
-      </w:r>
-      <w:r>
-        <w:t>i</w:t>
-      </w:r>
-      <w:r>
-        <w:t>f %}</w:t>
+        <w:t>{%p endif %}</w:t>
       </w:r>
     </w:p>
     <w:p>
@@ -1076,10 +1063,7 @@
         <w:t xml:space="preserve"> </w:t>
       </w:r>
       <w:r>
-        <w:t xml:space="preserve">if </w:t>
-      </w:r>
-      <w:r>
-        <w:t>payment == "</w:t>
+        <w:t>if payment == "</w:t>
       </w:r>
       <w:proofErr w:type="spellStart"/>
       <w:r>
@@ -1087,10 +1071,7 @@
       </w:r>
       <w:proofErr w:type="spellEnd"/>
       <w:r>
-        <w:t>"</w:t>
-      </w:r>
-      <w:r>
-        <w:t xml:space="preserve"> %}</w:t>
+        <w:t>" %}</w:t>
       </w:r>
     </w:p>
     <w:p>
@@ -1147,25 +1128,7 @@
           <w:sz w:val="24"/>
           <w:szCs w:val="24"/>
         </w:rPr>
-        <w:t xml:space="preserve">{%p </w:t>
-      </w:r>
-      <w:r>
-        <w:rPr>
-          <w:rFonts w:ascii="Times New Roman" w:hAnsi="Times New Roman" w:cs="Times New Roman"/>
-          <w:bCs/>
-          <w:sz w:val="24"/>
-          <w:szCs w:val="24"/>
-        </w:rPr>
-        <w:t>else</w:t>
-      </w:r>
-      <w:r>
-        <w:rPr>
-          <w:rFonts w:ascii="Times New Roman" w:hAnsi="Times New Roman" w:cs="Times New Roman"/>
-          <w:bCs/>
-          <w:sz w:val="24"/>
-          <w:szCs w:val="24"/>
-        </w:rPr>
-        <w:t xml:space="preserve"> %}</w:t>
+        <w:t>{%p else %}</w:t>
       </w:r>
     </w:p>
     <w:p>
@@ -1428,13 +1391,7 @@
         <w:pStyle w:val="BodyText"/>
       </w:pPr>
       <w:r>
-        <w:t xml:space="preserve">{%p for </w:t>
-      </w:r>
-      <w:r>
-        <w:t>relief</w:t>
-      </w:r>
-      <w:r>
-        <w:t xml:space="preserve"> in </w:t>
+        <w:t xml:space="preserve">{%p for relief in </w:t>
       </w:r>
       <w:proofErr w:type="spellStart"/>
       <w:r>
@@ -1442,10 +1399,7 @@
       </w:r>
       <w:proofErr w:type="gramStart"/>
       <w:r>
-        <w:t>reliefs</w:t>
-      </w:r>
-      <w:r>
-        <w:t>.complete</w:t>
+        <w:t>reliefs.complete</w:t>
       </w:r>
       <w:proofErr w:type="gramEnd"/>
       <w:r>
@@ -1490,14 +1444,7 @@
         <w:pStyle w:val="BodyText"/>
       </w:pPr>
       <w:r>
-        <w:lastRenderedPageBreak/>
-        <w:t>{%</w:t>
-      </w:r>
-      <w:r>
-        <w:t>p</w:t>
-      </w:r>
-      <w:r>
-        <w:t xml:space="preserve"> </w:t>
+        <w:t xml:space="preserve">{%p </w:t>
       </w:r>
       <w:proofErr w:type="spellStart"/>
       <w:r>

</xml_diff>

<commit_message>
more fixes to templates and merged_counterclaims_text logic
</commit_message>
<xml_diff>
--- a/docassemble/VTSuperiorCourtDebtAnswer/data/templates/superior_court_debt_answer.docx
+++ b/docassemble/VTSuperiorCourtDebtAnswer/data/templates/superior_court_debt_answer.docx
@@ -180,6 +180,11 @@
       <w:pPr>
         <w:pStyle w:val="BodyText"/>
       </w:pPr>
+    </w:p>
+    <w:p>
+      <w:pPr>
+        <w:pStyle w:val="BodyText"/>
+      </w:pPr>
       <w:r>
         <w:t>Here is our answer to the Complaint:</w:t>
       </w:r>
@@ -229,6 +234,11 @@
       <w:r>
         <w:t>. I am representing myself.</w:t>
       </w:r>
+    </w:p>
+    <w:p>
+      <w:pPr>
+        <w:pStyle w:val="BodyText"/>
+      </w:pPr>
     </w:p>
     <w:p>
       <w:pPr>
@@ -244,18 +254,15 @@
         <w:keepLines/>
         <w:rPr>
           <w:rFonts w:ascii="Times New Roman" w:hAnsi="Times New Roman" w:cs="Times New Roman"/>
+        </w:rPr>
+      </w:pPr>
+      <w:r>
+        <w:rPr>
+          <w:rFonts w:ascii="Times New Roman" w:hAnsi="Times New Roman" w:cs="Times New Roman"/>
           <w:bCs/>
           <w:sz w:val="24"/>
           <w:szCs w:val="24"/>
         </w:rPr>
-      </w:pPr>
-      <w:r>
-        <w:rPr>
-          <w:rFonts w:ascii="Times New Roman" w:hAnsi="Times New Roman" w:cs="Times New Roman"/>
-          <w:bCs/>
-          <w:sz w:val="24"/>
-          <w:szCs w:val="24"/>
-        </w:rPr>
         <w:t>{%p endif %}</w:t>
       </w:r>
     </w:p>
@@ -263,11 +270,6 @@
       <w:pPr>
         <w:pStyle w:val="BodyText"/>
       </w:pPr>
-    </w:p>
-    <w:p>
-      <w:pPr>
-        <w:pStyle w:val="BodyText"/>
-      </w:pPr>
       <w:r>
         <w:t xml:space="preserve">{%p for response in </w:t>
       </w:r>
@@ -722,49 +724,41 @@
       <w:pPr>
         <w:pStyle w:val="BodyText"/>
       </w:pPr>
-    </w:p>
-    <w:p>
-      <w:pPr>
-        <w:pStyle w:val="BodyText"/>
-      </w:pPr>
       <w:r>
         <w:t xml:space="preserve">{%p if </w:t>
       </w:r>
       <w:proofErr w:type="spellStart"/>
-      <w:r>
-        <w:t>len</w:t>
+      <w:proofErr w:type="gramStart"/>
+      <w:r>
+        <w:t>defenses.true</w:t>
+      </w:r>
+      <w:proofErr w:type="gramEnd"/>
+      <w:r>
+        <w:t>_</w:t>
+      </w:r>
+      <w:proofErr w:type="gramStart"/>
+      <w:r>
+        <w:t>values</w:t>
       </w:r>
       <w:proofErr w:type="spellEnd"/>
       <w:r>
         <w:t>(</w:t>
       </w:r>
-      <w:proofErr w:type="spellStart"/>
-      <w:proofErr w:type="gramStart"/>
-      <w:r>
-        <w:t>defenses.true</w:t>
-      </w:r>
-      <w:proofErr w:type="gramEnd"/>
-      <w:r>
-        <w:t>_</w:t>
-      </w:r>
-      <w:proofErr w:type="gramStart"/>
-      <w:r>
-        <w:t>values</w:t>
-      </w:r>
-      <w:proofErr w:type="spellEnd"/>
-      <w:r>
-        <w:t>(</w:t>
-      </w:r>
-      <w:proofErr w:type="gramEnd"/>
-      <w:r>
-        <w:t xml:space="preserve">)) </w:t>
-      </w:r>
-      <w:r>
-        <w:t xml:space="preserve">&gt; 0 </w:t>
+      <w:proofErr w:type="gramEnd"/>
+      <w:r>
+        <w:t>) | length &gt; 0</w:t>
+      </w:r>
+      <w:r>
+        <w:t xml:space="preserve"> </w:t>
       </w:r>
       <w:r>
         <w:t>%}</w:t>
       </w:r>
+    </w:p>
+    <w:p>
+      <w:pPr>
+        <w:pStyle w:val="BodyText"/>
+      </w:pPr>
     </w:p>
     <w:p>
       <w:pPr>
@@ -877,6 +871,7 @@
         <w:outlineLvl w:val="0"/>
       </w:pPr>
       <w:r>
+        <w:lastRenderedPageBreak/>
         <w:t xml:space="preserve">{%p </w:t>
       </w:r>
       <w:proofErr w:type="spellStart"/>
@@ -898,10 +893,6 @@
         <w:outlineLvl w:val="0"/>
       </w:pPr>
       <w:r>
-        <w:lastRenderedPageBreak/>
-        <w:t xml:space="preserve">      </w:t>
-      </w:r>
-      <w:r>
         <w:t>{</w:t>
       </w:r>
       <w:r>
@@ -961,9 +952,6 @@
         <w:outlineLvl w:val="0"/>
       </w:pPr>
       <w:r>
-        <w:t xml:space="preserve">      </w:t>
-      </w:r>
-      <w:r>
         <w:t>{%p endif %}</w:t>
       </w:r>
     </w:p>
@@ -999,11 +987,6 @@
         </w:rPr>
         <w:t>{%p endif %}</w:t>
       </w:r>
-    </w:p>
-    <w:p>
-      <w:pPr>
-        <w:pStyle w:val="BodyText"/>
-      </w:pPr>
     </w:p>
     <w:p>
       <w:pPr>
@@ -1271,11 +1254,6 @@
       <w:pPr>
         <w:pStyle w:val="BodyText"/>
       </w:pPr>
-    </w:p>
-    <w:p>
-      <w:pPr>
-        <w:pStyle w:val="BodyText"/>
-      </w:pPr>
       <w:r>
         <w:t xml:space="preserve">{%p if </w:t>
       </w:r>
@@ -1325,11 +1303,6 @@
       <w:pPr>
         <w:pStyle w:val="BodyText"/>
       </w:pPr>
-    </w:p>
-    <w:p>
-      <w:pPr>
-        <w:pStyle w:val="BodyText"/>
-      </w:pPr>
       <w:r>
         <w:t>{%p</w:t>
       </w:r>
@@ -1380,11 +1353,6 @@
         </w:rPr>
         <w:t>{%p endif %}</w:t>
       </w:r>
-    </w:p>
-    <w:p>
-      <w:pPr>
-        <w:pStyle w:val="BodyText"/>
-      </w:pPr>
     </w:p>
     <w:p>
       <w:pPr>
@@ -1464,11 +1432,6 @@
       <w:pPr>
         <w:pStyle w:val="BodyText"/>
       </w:pPr>
-    </w:p>
-    <w:p>
-      <w:pPr>
-        <w:pStyle w:val="BodyText"/>
-      </w:pPr>
       <w:r>
         <w:t xml:space="preserve">Defendant is </w:t>
       </w:r>
@@ -1494,7 +1457,11 @@
         <w:t>ch</w:t>
       </w:r>
       <w:r>
-        <w:t xml:space="preserve"> I will also file with the court to show</w:t>
+        <w:t xml:space="preserve"> I will also file </w:t>
+      </w:r>
+      <w:r>
+        <w:lastRenderedPageBreak/>
+        <w:t>with the court to show</w:t>
       </w:r>
       <w:r>
         <w:t xml:space="preserve"> I </w:t>

</xml_diff>

<commit_message>
included VTCourtForms in footer of answer template
</commit_message>
<xml_diff>
--- a/docassemble/VTSuperiorCourtDebtAnswer/data/templates/superior_court_debt_answer.docx
+++ b/docassemble/VTSuperiorCourtDebtAnswer/data/templates/superior_court_debt_answer.docx
@@ -1,6 +1,6 @@
 
 <file path=word/document.xml><?xml version="1.0" encoding="utf-8"?>
-<w:document xmlns:wpc="http://schemas.microsoft.com/office/word/2010/wordprocessingCanvas" xmlns:cx="http://schemas.microsoft.com/office/drawing/2014/chartex" xmlns:cx1="http://schemas.microsoft.com/office/drawing/2015/9/8/chartex" xmlns:cx2="http://schemas.microsoft.com/office/drawing/2015/10/21/chartex" xmlns:cx3="http://schemas.microsoft.com/office/drawing/2016/5/9/chartex" xmlns:cx4="http://schemas.microsoft.com/office/drawing/2016/5/10/chartex" xmlns:cx5="http://schemas.microsoft.com/office/drawing/2016/5/11/chartex" xmlns:cx6="http://schemas.microsoft.com/office/drawing/2016/5/12/chartex" xmlns:cx7="http://schemas.microsoft.com/office/drawing/2016/5/13/chartex" xmlns:cx8="http://schemas.microsoft.com/office/drawing/2016/5/14/chartex" xmlns:mc="http://schemas.openxmlformats.org/markup-compatibility/2006" xmlns:m="http://schemas.openxmlformats.org/officeDocument/2006/math" xmlns:aink="http://schemas.microsoft.com/office/drawing/2016/ink" xmlns:am3d="http://schemas.microsoft.com/office/drawing/2017/model3d" xmlns:oel="http://schemas.microsoft.com/office/2019/extlst" xmlns:r="http://schemas.openxmlformats.org/officeDocument/2006/relationships" xmlns:wp14="http://schemas.microsoft.com/office/word/2010/wordprocessingDrawing" xmlns:wp="http://schemas.openxmlformats.org/drawingml/2006/wordprocessingDrawing" xmlns:wpg="http://schemas.microsoft.com/office/word/2010/wordprocessingGroup" xmlns:wpi="http://schemas.microsoft.com/office/word/2010/wordprocessingInk" xmlns:wps="http://schemas.microsoft.com/office/word/2010/wordprocessingShape" xmlns:o="urn:schemas-microsoft-com:office:office" xmlns:v="urn:schemas-microsoft-com:vml" xmlns:w10="urn:schemas-microsoft-com:office:word" xmlns:w="http://schemas.openxmlformats.org/wordprocessingml/2006/main" xmlns:w14="http://schemas.microsoft.com/office/word/2010/wordml" xmlns:w15="http://schemas.microsoft.com/office/word/2012/wordml" xmlns:w16cex="http://schemas.microsoft.com/office/word/2018/wordml/cex" xmlns:w16cid="http://schemas.microsoft.com/office/word/2016/wordml/cid" xmlns:w16="http://schemas.microsoft.com/office/word/2018/wordml" xmlns:w16sdtdh="http://schemas.microsoft.com/office/word/2020/wordml/sdtdatahash" xmlns:w16sdtfl="http://schemas.microsoft.com/office/word/2024/wordml/sdtformatlock" xmlns:w16se="http://schemas.microsoft.com/office/word/2015/wordml/symex" xmlns:w16du="http://schemas.microsoft.com/office/word/2023/wordml/word16du" xmlns:wne="http://schemas.microsoft.com/office/word/2006/wordml" mc:Ignorable="w14 w15 w16se w16cid w16 w16cex w16sdtdh w16sdtfl w16du wp14">
+<w:document xmlns:wpc="http://schemas.microsoft.com/office/word/2010/wordprocessingCanvas" xmlns:cx="http://schemas.microsoft.com/office/drawing/2014/chartex" xmlns:cx1="http://schemas.microsoft.com/office/drawing/2015/9/8/chartex" xmlns:cx2="http://schemas.microsoft.com/office/drawing/2015/10/21/chartex" xmlns:cx3="http://schemas.microsoft.com/office/drawing/2016/5/9/chartex" xmlns:cx4="http://schemas.microsoft.com/office/drawing/2016/5/10/chartex" xmlns:cx5="http://schemas.microsoft.com/office/drawing/2016/5/11/chartex" xmlns:cx6="http://schemas.microsoft.com/office/drawing/2016/5/12/chartex" xmlns:cx7="http://schemas.microsoft.com/office/drawing/2016/5/13/chartex" xmlns:cx8="http://schemas.microsoft.com/office/drawing/2016/5/14/chartex" xmlns:mc="http://schemas.openxmlformats.org/markup-compatibility/2006" xmlns:aink="http://schemas.microsoft.com/office/drawing/2016/ink" xmlns:am3d="http://schemas.microsoft.com/office/drawing/2017/model3d" xmlns:o="urn:schemas-microsoft-com:office:office" xmlns:oel="http://schemas.microsoft.com/office/2019/extlst" xmlns:r="http://schemas.openxmlformats.org/officeDocument/2006/relationships" xmlns:m="http://schemas.openxmlformats.org/officeDocument/2006/math" xmlns:v="urn:schemas-microsoft-com:vml" xmlns:wp14="http://schemas.microsoft.com/office/word/2010/wordprocessingDrawing" xmlns:wp="http://schemas.openxmlformats.org/drawingml/2006/wordprocessingDrawing" xmlns:w10="urn:schemas-microsoft-com:office:word" xmlns:w="http://schemas.openxmlformats.org/wordprocessingml/2006/main" xmlns:w14="http://schemas.microsoft.com/office/word/2010/wordml" xmlns:w15="http://schemas.microsoft.com/office/word/2012/wordml" xmlns:w16cex="http://schemas.microsoft.com/office/word/2018/wordml/cex" xmlns:w16cid="http://schemas.microsoft.com/office/word/2016/wordml/cid" xmlns:w16="http://schemas.microsoft.com/office/word/2018/wordml" xmlns:w16du="http://schemas.microsoft.com/office/word/2023/wordml/word16du" xmlns:w16sdtdh="http://schemas.microsoft.com/office/word/2020/wordml/sdtdatahash" xmlns:w16sdtfl="http://schemas.microsoft.com/office/word/2024/wordml/sdtformatlock" xmlns:w16se="http://schemas.microsoft.com/office/word/2015/wordml/symex" xmlns:wpg="http://schemas.microsoft.com/office/word/2010/wordprocessingGroup" xmlns:wpi="http://schemas.microsoft.com/office/word/2010/wordprocessingInk" xmlns:wne="http://schemas.microsoft.com/office/word/2006/wordml" xmlns:wps="http://schemas.microsoft.com/office/word/2010/wordprocessingShape" mc:Ignorable="w14 w15 w16se w16cid w16 w16cex w16sdtdh w16sdtfl w16du wp14">
   <w:body>
     <w:p>
       <w:pPr>
@@ -19,14 +19,6 @@
           <w:rFonts w:eastAsia="Times New Roman" w:cs="Times New Roman"/>
           <w:szCs w:val="24"/>
         </w:rPr>
-        <w:sectPr>
-          <w:footerReference w:type="default" r:id="rId7"/>
-          <w:type w:val="continuous"/>
-          <w:pgSz w:w="12240" w:h="15840"/>
-          <w:pgMar w:top="1440" w:right="1440" w:bottom="1440" w:left="1440" w:header="720" w:footer="720" w:gutter="0"/>
-          <w:cols w:space="720"/>
-          <w:docGrid w:linePitch="299"/>
-        </w:sectPr>
       </w:pPr>
       <w:r>
         <w:rPr>
@@ -41,86 +33,50 @@
           <w:rFonts w:eastAsia="Times New Roman" w:cs="Times New Roman"/>
           <w:szCs w:val="24"/>
         </w:rPr>
-        <w:t>include_docx_</w:t>
-      </w:r>
-      <w:proofErr w:type="gramStart"/>
+        <w:t>include_docx_template</w:t>
+      </w:r>
+      <w:proofErr w:type="spellEnd"/>
       <w:r>
         <w:rPr>
           <w:rFonts w:eastAsia="Times New Roman" w:cs="Times New Roman"/>
           <w:szCs w:val="24"/>
         </w:rPr>
-        <w:t>template</w:t>
-      </w:r>
-      <w:proofErr w:type="spellEnd"/>
+        <w:t xml:space="preserve">('include_caption.docx', </w:t>
+      </w:r>
+      <w:proofErr w:type="spellStart"/>
       <w:r>
         <w:rPr>
           <w:rFonts w:eastAsia="Times New Roman" w:cs="Times New Roman"/>
           <w:szCs w:val="24"/>
         </w:rPr>
-        <w:t>(</w:t>
-      </w:r>
-      <w:proofErr w:type="gramEnd"/>
+        <w:t>caption_title</w:t>
+      </w:r>
+      <w:proofErr w:type="spellEnd"/>
       <w:r>
         <w:rPr>
           <w:rFonts w:eastAsia="Times New Roman" w:cs="Times New Roman"/>
           <w:szCs w:val="24"/>
         </w:rPr>
-        <w:t xml:space="preserve">'include_caption.docx', </w:t>
-      </w:r>
-      <w:proofErr w:type="spellStart"/>
+        <w:t>=</w:t>
+      </w:r>
       <w:r>
         <w:rPr>
           <w:rFonts w:eastAsia="Times New Roman" w:cs="Times New Roman"/>
           <w:szCs w:val="24"/>
         </w:rPr>
-        <w:t>caption_title</w:t>
-      </w:r>
-      <w:proofErr w:type="spellEnd"/>
-      <w:proofErr w:type="gramStart"/>
+        <w:t>“”</w:t>
+      </w:r>
       <w:r>
         <w:rPr>
           <w:rFonts w:eastAsia="Times New Roman" w:cs="Times New Roman"/>
           <w:szCs w:val="24"/>
         </w:rPr>
-        <w:t>=</w:t>
-      </w:r>
-      <w:r>
-        <w:rPr>
-          <w:rFonts w:eastAsia="Times New Roman" w:cs="Times New Roman"/>
-          <w:szCs w:val="24"/>
-        </w:rPr>
-        <w:t>“</w:t>
-      </w:r>
-      <w:proofErr w:type="gramEnd"/>
-      <w:r>
-        <w:rPr>
-          <w:rFonts w:eastAsia="Times New Roman" w:cs="Times New Roman"/>
-          <w:szCs w:val="24"/>
-        </w:rPr>
-        <w:t>”</w:t>
-      </w:r>
-      <w:r>
-        <w:rPr>
-          <w:rFonts w:eastAsia="Times New Roman" w:cs="Times New Roman"/>
-          <w:szCs w:val="24"/>
-        </w:rPr>
         <w:t>) }}</w:t>
       </w:r>
     </w:p>
     <w:p>
       <w:pPr>
-        <w:pStyle w:val="BodyText"/>
-        <w:sectPr>
-          <w:type w:val="continuous"/>
-          <w:pgSz w:w="12240" w:h="15840"/>
-          <w:pgMar w:top="1380" w:right="1320" w:bottom="280" w:left="1340" w:header="720" w:footer="720" w:gutter="0"/>
-          <w:cols w:space="720"/>
-        </w:sectPr>
-      </w:pPr>
-    </w:p>
-    <w:p>
-      <w:pPr>
-        <w:pStyle w:val="BodyText"/>
+        <w:spacing w:line="360" w:lineRule="auto"/>
       </w:pPr>
     </w:p>
     <w:p>
@@ -154,15 +110,7 @@
         <w:pStyle w:val="BodyText"/>
       </w:pPr>
       <w:r>
-        <w:t xml:space="preserve">We are Defendants </w:t>
-      </w:r>
-      <w:proofErr w:type="gramStart"/>
-      <w:r>
-        <w:t>{{ users</w:t>
-      </w:r>
-      <w:proofErr w:type="gramEnd"/>
-      <w:r>
-        <w:t xml:space="preserve"> }}. We are representing ourselves.</w:t>
+        <w:t>We are Defendants {{ users }}. We are representing ourselves.</w:t>
       </w:r>
     </w:p>
     <w:p>
@@ -198,21 +146,8 @@
       <w:r>
         <w:t xml:space="preserve">I, </w:t>
       </w:r>
-      <w:proofErr w:type="gramStart"/>
-      <w:r>
-        <w:t>{{ users</w:t>
-      </w:r>
-      <w:proofErr w:type="gramEnd"/>
-      <w:r>
-        <w:t>[0</w:t>
-      </w:r>
-      <w:proofErr w:type="gramStart"/>
-      <w:r>
-        <w:t>] }</w:t>
-      </w:r>
-      <w:proofErr w:type="gramEnd"/>
-      <w:r>
-        <w:t>}</w:t>
+      <w:r>
+        <w:t>{{ users[0] }}</w:t>
       </w:r>
       <w:r>
         <w:t xml:space="preserve">, am the Defendant in this </w:t>
@@ -263,27 +198,11 @@
       </w:r>
       <w:proofErr w:type="spellStart"/>
       <w:r>
-        <w:t>allegation_</w:t>
-      </w:r>
-      <w:proofErr w:type="gramStart"/>
-      <w:r>
-        <w:t>answers.complete</w:t>
-      </w:r>
-      <w:proofErr w:type="gramEnd"/>
-      <w:r>
-        <w:t>_</w:t>
-      </w:r>
-      <w:proofErr w:type="gramStart"/>
-      <w:r>
-        <w:t>elements</w:t>
+        <w:t>allegation_answers.complete_elements</w:t>
       </w:r>
       <w:proofErr w:type="spellEnd"/>
       <w:r>
-        <w:t>(</w:t>
-      </w:r>
-      <w:proofErr w:type="gramEnd"/>
-      <w:r>
-        <w:t>) %}</w:t>
+        <w:t>() %}</w:t>
       </w:r>
     </w:p>
     <w:p>
@@ -295,446 +214,215 @@
           <w:b/>
           <w:bCs/>
         </w:rPr>
-        <w:t xml:space="preserve">Paragraph </w:t>
-      </w:r>
-      <w:proofErr w:type="gramStart"/>
+        <w:t xml:space="preserve">Paragraph {{ </w:t>
+      </w:r>
+      <w:proofErr w:type="spellStart"/>
       <w:r>
         <w:rPr>
           <w:b/>
           <w:bCs/>
         </w:rPr>
-        <w:t xml:space="preserve">{{ </w:t>
-      </w:r>
-      <w:proofErr w:type="spellStart"/>
+        <w:t>loop.index</w:t>
+      </w:r>
+      <w:proofErr w:type="spellEnd"/>
       <w:r>
         <w:rPr>
           <w:b/>
           <w:bCs/>
         </w:rPr>
-        <w:t>loop</w:t>
-      </w:r>
-      <w:proofErr w:type="gramEnd"/>
+        <w:t xml:space="preserve"> }}:{% if </w:t>
+      </w:r>
+      <w:proofErr w:type="spellStart"/>
       <w:r>
         <w:rPr>
           <w:b/>
           <w:bCs/>
         </w:rPr>
-        <w:t>.</w:t>
-      </w:r>
-      <w:proofErr w:type="gramStart"/>
+        <w:t>response.choice</w:t>
+      </w:r>
+      <w:proofErr w:type="spellEnd"/>
       <w:r>
         <w:rPr>
           <w:b/>
           <w:bCs/>
         </w:rPr>
-        <w:t>index</w:t>
-      </w:r>
-      <w:proofErr w:type="spellEnd"/>
+        <w:t xml:space="preserve"> == "agree" %} I agree.{% endif %}{% if </w:t>
+      </w:r>
+      <w:proofErr w:type="spellStart"/>
       <w:r>
         <w:rPr>
           <w:b/>
           <w:bCs/>
         </w:rPr>
-        <w:t xml:space="preserve"> }}:{</w:t>
-      </w:r>
-      <w:proofErr w:type="gramEnd"/>
+        <w:t>response.choice</w:t>
+      </w:r>
+      <w:proofErr w:type="spellEnd"/>
       <w:r>
         <w:rPr>
           <w:b/>
           <w:bCs/>
         </w:rPr>
-        <w:t xml:space="preserve">% if </w:t>
+        <w:t xml:space="preserve"> == "disagree" %} I disagree. {{ </w:t>
       </w:r>
       <w:proofErr w:type="spellStart"/>
-      <w:proofErr w:type="gramStart"/>
       <w:r>
         <w:rPr>
           <w:b/>
           <w:bCs/>
         </w:rPr>
-        <w:t>response.choice</w:t>
+        <w:t>response.explanation</w:t>
       </w:r>
       <w:proofErr w:type="spellEnd"/>
-      <w:proofErr w:type="gramEnd"/>
       <w:r>
         <w:rPr>
           <w:b/>
           <w:bCs/>
         </w:rPr>
-        <w:t xml:space="preserve"> == "agree" %} I </w:t>
-      </w:r>
-      <w:proofErr w:type="gramStart"/>
+        <w:t xml:space="preserve"> }}{% endif %}{% if </w:t>
+      </w:r>
+      <w:proofErr w:type="spellStart"/>
       <w:r>
         <w:rPr>
           <w:b/>
           <w:bCs/>
         </w:rPr>
-        <w:t>agree.{</w:t>
-      </w:r>
-      <w:proofErr w:type="gramEnd"/>
+        <w:t>response.choice</w:t>
+      </w:r>
+      <w:proofErr w:type="spellEnd"/>
       <w:r>
         <w:rPr>
           <w:b/>
           <w:bCs/>
         </w:rPr>
-        <w:t xml:space="preserve">% endif </w:t>
-      </w:r>
-      <w:proofErr w:type="gramStart"/>
+        <w:t xml:space="preserve"> == "</w:t>
+      </w:r>
+      <w:proofErr w:type="spellStart"/>
       <w:r>
         <w:rPr>
           <w:b/>
           <w:bCs/>
         </w:rPr>
-        <w:t>%}{</w:t>
-      </w:r>
-      <w:proofErr w:type="gramEnd"/>
+        <w:t>agree_disagree</w:t>
+      </w:r>
+      <w:proofErr w:type="spellEnd"/>
       <w:r>
         <w:rPr>
           <w:b/>
           <w:bCs/>
         </w:rPr>
-        <w:t xml:space="preserve">% if </w:t>
+        <w:t xml:space="preserve">" %} I agree with part and disagree with part. {{ </w:t>
       </w:r>
       <w:proofErr w:type="spellStart"/>
-      <w:proofErr w:type="gramStart"/>
       <w:r>
         <w:rPr>
           <w:b/>
           <w:bCs/>
         </w:rPr>
-        <w:t>response.choice</w:t>
+        <w:t>response.explanation</w:t>
       </w:r>
       <w:proofErr w:type="spellEnd"/>
-      <w:proofErr w:type="gramEnd"/>
       <w:r>
         <w:rPr>
           <w:b/>
           <w:bCs/>
         </w:rPr>
-        <w:t xml:space="preserve"> == "disagree" %} I disagree. </w:t>
-      </w:r>
-      <w:proofErr w:type="gramStart"/>
+        <w:t xml:space="preserve"> }}{% endif %}{% if </w:t>
+      </w:r>
+      <w:proofErr w:type="spellStart"/>
       <w:r>
         <w:rPr>
           <w:b/>
           <w:bCs/>
         </w:rPr>
-        <w:t xml:space="preserve">{{ </w:t>
-      </w:r>
-      <w:proofErr w:type="spellStart"/>
+        <w:t>response.choice</w:t>
+      </w:r>
+      <w:proofErr w:type="spellEnd"/>
       <w:r>
         <w:rPr>
           <w:b/>
           <w:bCs/>
         </w:rPr>
-        <w:t>response</w:t>
-      </w:r>
-      <w:proofErr w:type="gramEnd"/>
+        <w:t xml:space="preserve"> == "</w:t>
+      </w:r>
+      <w:proofErr w:type="spellStart"/>
       <w:r>
         <w:rPr>
           <w:b/>
           <w:bCs/>
         </w:rPr>
-        <w:t>.</w:t>
-      </w:r>
-      <w:proofErr w:type="gramStart"/>
+        <w:t>dont_know</w:t>
+      </w:r>
+      <w:proofErr w:type="spellEnd"/>
       <w:r>
         <w:rPr>
           <w:b/>
           <w:bCs/>
         </w:rPr>
-        <w:t>explanation</w:t>
-      </w:r>
-      <w:proofErr w:type="spellEnd"/>
+        <w:t xml:space="preserve">" %} I don't know if this is true.{% endif %}{% if </w:t>
+      </w:r>
+      <w:proofErr w:type="spellStart"/>
       <w:r>
         <w:rPr>
           <w:b/>
           <w:bCs/>
         </w:rPr>
-        <w:t xml:space="preserve"> }}{</w:t>
-      </w:r>
-      <w:proofErr w:type="gramEnd"/>
+        <w:t>response.choice</w:t>
+      </w:r>
+      <w:proofErr w:type="spellEnd"/>
       <w:r>
         <w:rPr>
           <w:b/>
           <w:bCs/>
         </w:rPr>
-        <w:t xml:space="preserve">% endif </w:t>
-      </w:r>
-      <w:proofErr w:type="gramStart"/>
+        <w:t xml:space="preserve"> == "</w:t>
+      </w:r>
+      <w:proofErr w:type="spellStart"/>
       <w:r>
         <w:rPr>
           <w:b/>
           <w:bCs/>
         </w:rPr>
-        <w:t>%}{</w:t>
-      </w:r>
-      <w:proofErr w:type="gramEnd"/>
+        <w:t>response_not_required</w:t>
+      </w:r>
+      <w:proofErr w:type="spellEnd"/>
       <w:r>
         <w:rPr>
           <w:b/>
           <w:bCs/>
         </w:rPr>
-        <w:t xml:space="preserve">% if </w:t>
+        <w:t>" %} No response required.{% endif %}</w:t>
+      </w:r>
+    </w:p>
+    <w:p>
+      <w:pPr>
+        <w:pStyle w:val="BodyText"/>
+      </w:pPr>
+      <w:r>
+        <w:t xml:space="preserve">{%p </w:t>
       </w:r>
       <w:proofErr w:type="spellStart"/>
-      <w:proofErr w:type="gramStart"/>
-      <w:r>
-        <w:rPr>
-          <w:b/>
-          <w:bCs/>
-        </w:rPr>
-        <w:t>response.choice</w:t>
+      <w:r>
+        <w:t>endfor</w:t>
       </w:r>
       <w:proofErr w:type="spellEnd"/>
-      <w:proofErr w:type="gramEnd"/>
-      <w:r>
-        <w:rPr>
-          <w:b/>
-          <w:bCs/>
-        </w:rPr>
-        <w:t xml:space="preserve"> == "</w:t>
+      <w:r>
+        <w:t xml:space="preserve"> %}</w:t>
+      </w:r>
+    </w:p>
+    <w:p>
+      <w:pPr>
+        <w:pStyle w:val="BodyText"/>
+      </w:pPr>
+      <w:r>
+        <w:t xml:space="preserve">{%p if </w:t>
       </w:r>
       <w:proofErr w:type="spellStart"/>
       <w:r>
-        <w:rPr>
-          <w:b/>
-          <w:bCs/>
-        </w:rPr>
-        <w:t>agree_disagree</w:t>
+        <w:t>defenses.true_values</w:t>
       </w:r>
       <w:proofErr w:type="spellEnd"/>
       <w:r>
-        <w:rPr>
-          <w:b/>
-          <w:bCs/>
-        </w:rPr>
-        <w:t xml:space="preserve">" %} I agree with part and disagree with part. </w:t>
-      </w:r>
-      <w:proofErr w:type="gramStart"/>
-      <w:r>
-        <w:rPr>
-          <w:b/>
-          <w:bCs/>
-        </w:rPr>
-        <w:t xml:space="preserve">{{ </w:t>
-      </w:r>
-      <w:proofErr w:type="spellStart"/>
-      <w:r>
-        <w:rPr>
-          <w:b/>
-          <w:bCs/>
-        </w:rPr>
-        <w:t>response</w:t>
-      </w:r>
-      <w:proofErr w:type="gramEnd"/>
-      <w:r>
-        <w:rPr>
-          <w:b/>
-          <w:bCs/>
-        </w:rPr>
-        <w:t>.</w:t>
-      </w:r>
-      <w:proofErr w:type="gramStart"/>
-      <w:r>
-        <w:rPr>
-          <w:b/>
-          <w:bCs/>
-        </w:rPr>
-        <w:t>explanation</w:t>
-      </w:r>
-      <w:proofErr w:type="spellEnd"/>
-      <w:r>
-        <w:rPr>
-          <w:b/>
-          <w:bCs/>
-        </w:rPr>
-        <w:t xml:space="preserve"> }}{</w:t>
-      </w:r>
-      <w:proofErr w:type="gramEnd"/>
-      <w:r>
-        <w:rPr>
-          <w:b/>
-          <w:bCs/>
-        </w:rPr>
-        <w:t xml:space="preserve">% endif </w:t>
-      </w:r>
-      <w:proofErr w:type="gramStart"/>
-      <w:r>
-        <w:rPr>
-          <w:b/>
-          <w:bCs/>
-        </w:rPr>
-        <w:t>%}{</w:t>
-      </w:r>
-      <w:proofErr w:type="gramEnd"/>
-      <w:r>
-        <w:rPr>
-          <w:b/>
-          <w:bCs/>
-        </w:rPr>
-        <w:t xml:space="preserve">% if </w:t>
-      </w:r>
-      <w:proofErr w:type="spellStart"/>
-      <w:proofErr w:type="gramStart"/>
-      <w:r>
-        <w:rPr>
-          <w:b/>
-          <w:bCs/>
-        </w:rPr>
-        <w:t>response.choice</w:t>
-      </w:r>
-      <w:proofErr w:type="spellEnd"/>
-      <w:proofErr w:type="gramEnd"/>
-      <w:r>
-        <w:rPr>
-          <w:b/>
-          <w:bCs/>
-        </w:rPr>
-        <w:t xml:space="preserve"> == "</w:t>
-      </w:r>
-      <w:proofErr w:type="spellStart"/>
-      <w:r>
-        <w:rPr>
-          <w:b/>
-          <w:bCs/>
-        </w:rPr>
-        <w:t>dont_know</w:t>
-      </w:r>
-      <w:proofErr w:type="spellEnd"/>
-      <w:r>
-        <w:rPr>
-          <w:b/>
-          <w:bCs/>
-        </w:rPr>
-        <w:t xml:space="preserve">" %} I don't know if this is </w:t>
-      </w:r>
-      <w:proofErr w:type="gramStart"/>
-      <w:r>
-        <w:rPr>
-          <w:b/>
-          <w:bCs/>
-        </w:rPr>
-        <w:t>true.{</w:t>
-      </w:r>
-      <w:proofErr w:type="gramEnd"/>
-      <w:r>
-        <w:rPr>
-          <w:b/>
-          <w:bCs/>
-        </w:rPr>
-        <w:t xml:space="preserve">% endif </w:t>
-      </w:r>
-      <w:proofErr w:type="gramStart"/>
-      <w:r>
-        <w:rPr>
-          <w:b/>
-          <w:bCs/>
-        </w:rPr>
-        <w:t>%}{</w:t>
-      </w:r>
-      <w:proofErr w:type="gramEnd"/>
-      <w:r>
-        <w:rPr>
-          <w:b/>
-          <w:bCs/>
-        </w:rPr>
-        <w:t xml:space="preserve">% if </w:t>
-      </w:r>
-      <w:proofErr w:type="spellStart"/>
-      <w:proofErr w:type="gramStart"/>
-      <w:r>
-        <w:rPr>
-          <w:b/>
-          <w:bCs/>
-        </w:rPr>
-        <w:t>response.choice</w:t>
-      </w:r>
-      <w:proofErr w:type="spellEnd"/>
-      <w:proofErr w:type="gramEnd"/>
-      <w:r>
-        <w:rPr>
-          <w:b/>
-          <w:bCs/>
-        </w:rPr>
-        <w:t xml:space="preserve"> == "</w:t>
-      </w:r>
-      <w:proofErr w:type="spellStart"/>
-      <w:r>
-        <w:rPr>
-          <w:b/>
-          <w:bCs/>
-        </w:rPr>
-        <w:t>response_not_required</w:t>
-      </w:r>
-      <w:proofErr w:type="spellEnd"/>
-      <w:r>
-        <w:rPr>
-          <w:b/>
-          <w:bCs/>
-        </w:rPr>
-        <w:t xml:space="preserve">" %} No response </w:t>
-      </w:r>
-      <w:proofErr w:type="gramStart"/>
-      <w:r>
-        <w:rPr>
-          <w:b/>
-          <w:bCs/>
-        </w:rPr>
-        <w:t>required.{</w:t>
-      </w:r>
-      <w:proofErr w:type="gramEnd"/>
-      <w:r>
-        <w:rPr>
-          <w:b/>
-          <w:bCs/>
-        </w:rPr>
-        <w:t>% endif %}</w:t>
-      </w:r>
-    </w:p>
-    <w:p>
-      <w:pPr>
-        <w:pStyle w:val="BodyText"/>
-      </w:pPr>
-      <w:r>
-        <w:t xml:space="preserve">{%p </w:t>
-      </w:r>
-      <w:proofErr w:type="spellStart"/>
-      <w:r>
-        <w:t>endfor</w:t>
-      </w:r>
-      <w:proofErr w:type="spellEnd"/>
-      <w:r>
-        <w:t xml:space="preserve"> %}</w:t>
-      </w:r>
-    </w:p>
-    <w:p>
-      <w:pPr>
-        <w:pStyle w:val="BodyText"/>
-      </w:pPr>
-      <w:r>
-        <w:t xml:space="preserve">{%p if </w:t>
-      </w:r>
-      <w:proofErr w:type="spellStart"/>
-      <w:proofErr w:type="gramStart"/>
-      <w:r>
-        <w:t>defenses.true</w:t>
-      </w:r>
-      <w:proofErr w:type="gramEnd"/>
-      <w:r>
-        <w:t>_</w:t>
-      </w:r>
-      <w:proofErr w:type="gramStart"/>
-      <w:r>
-        <w:t>values</w:t>
-      </w:r>
-      <w:proofErr w:type="spellEnd"/>
-      <w:r>
-        <w:t>(</w:t>
-      </w:r>
-      <w:proofErr w:type="gramEnd"/>
-      <w:r>
-        <w:t xml:space="preserve">) | length &gt; 0 </w:t>
+        <w:t xml:space="preserve">() | length &gt; 0 </w:t>
       </w:r>
       <w:r>
         <w:t>%}</w:t>
@@ -788,25 +476,12 @@
         <w:t xml:space="preserve">{%p for defense in </w:t>
       </w:r>
       <w:proofErr w:type="spellStart"/>
-      <w:proofErr w:type="gramStart"/>
-      <w:r>
-        <w:t>defenses.true</w:t>
-      </w:r>
-      <w:proofErr w:type="gramEnd"/>
-      <w:r>
-        <w:t>_</w:t>
-      </w:r>
-      <w:proofErr w:type="gramStart"/>
-      <w:r>
-        <w:t>values</w:t>
+      <w:r>
+        <w:t>defenses.true_values</w:t>
       </w:r>
       <w:proofErr w:type="spellEnd"/>
       <w:r>
-        <w:t>(</w:t>
-      </w:r>
-      <w:proofErr w:type="gramEnd"/>
-      <w:r>
-        <w:t>)</w:t>
+        <w:t>()</w:t>
       </w:r>
       <w:r>
         <w:t xml:space="preserve"> %}</w:t>
@@ -821,29 +496,16 @@
         </w:numPr>
         <w:outlineLvl w:val="0"/>
       </w:pPr>
-      <w:proofErr w:type="gramStart"/>
       <w:r>
         <w:t xml:space="preserve">{{ </w:t>
       </w:r>
       <w:proofErr w:type="spellStart"/>
       <w:r>
-        <w:t>defenses</w:t>
-      </w:r>
-      <w:proofErr w:type="gramEnd"/>
-      <w:r>
-        <w:t>_terms</w:t>
+        <w:t>defenses_terms</w:t>
       </w:r>
       <w:proofErr w:type="spellEnd"/>
       <w:r>
-        <w:t>[defense</w:t>
-      </w:r>
-      <w:proofErr w:type="gramStart"/>
-      <w:r>
-        <w:t>] }</w:t>
-      </w:r>
-      <w:proofErr w:type="gramEnd"/>
-      <w:r>
-        <w:t>}</w:t>
+        <w:t>[defense] }}</w:t>
       </w:r>
     </w:p>
     <w:p>
@@ -856,7 +518,6 @@
         <w:outlineLvl w:val="0"/>
       </w:pPr>
       <w:r>
-        <w:lastRenderedPageBreak/>
         <w:t xml:space="preserve">{%p </w:t>
       </w:r>
       <w:proofErr w:type="spellStart"/>
@@ -878,6 +539,7 @@
         <w:outlineLvl w:val="0"/>
       </w:pPr>
       <w:r>
+        <w:lastRenderedPageBreak/>
         <w:t>{</w:t>
       </w:r>
       <w:r>
@@ -910,21 +572,8 @@
         </w:numPr>
         <w:outlineLvl w:val="0"/>
       </w:pPr>
-      <w:proofErr w:type="gramStart"/>
-      <w:r>
-        <w:t>{{ single</w:t>
-      </w:r>
-      <w:proofErr w:type="gramEnd"/>
-      <w:r>
-        <w:t>_paragraph(fix_punctuation(disagrees_additional_explanation)</w:t>
-      </w:r>
-      <w:proofErr w:type="gramStart"/>
-      <w:r>
-        <w:t>) }</w:t>
-      </w:r>
-      <w:proofErr w:type="gramEnd"/>
-      <w:r>
-        <w:t>}</w:t>
+      <w:r>
+        <w:t>{{ single_paragraph(fix_punctuation(disagrees_additional_explanation)) }}</w:t>
       </w:r>
     </w:p>
     <w:p>
@@ -1048,31 +697,15 @@
         </w:numPr>
       </w:pPr>
       <w:r>
-        <w:t xml:space="preserve">Defendant wishes to pay the debt in full by </w:t>
-      </w:r>
-      <w:proofErr w:type="gramStart"/>
-      <w:r>
-        <w:t xml:space="preserve">{{ </w:t>
+        <w:t xml:space="preserve">Defendant wishes to pay the debt in full by {{ </w:t>
       </w:r>
       <w:proofErr w:type="spellStart"/>
       <w:r>
-        <w:t>pay</w:t>
-      </w:r>
-      <w:proofErr w:type="gramEnd"/>
-      <w:r>
-        <w:t>_in_full_</w:t>
-      </w:r>
-      <w:proofErr w:type="gramStart"/>
-      <w:r>
-        <w:t>date</w:t>
+        <w:t>pay_in_full_date</w:t>
       </w:r>
       <w:proofErr w:type="spellEnd"/>
       <w:r>
-        <w:t xml:space="preserve"> }</w:t>
-      </w:r>
-      <w:proofErr w:type="gramEnd"/>
-      <w:r>
-        <w:t>}.</w:t>
+        <w:t xml:space="preserve"> }}.</w:t>
       </w:r>
     </w:p>
     <w:p>
@@ -1108,56 +741,30 @@
       <w:r>
         <w:t xml:space="preserve"> to make installment payments every </w:t>
       </w:r>
-      <w:proofErr w:type="gramStart"/>
       <w:r>
         <w:t xml:space="preserve">{{ </w:t>
       </w:r>
       <w:proofErr w:type="spellStart"/>
       <w:r>
-        <w:t>agrees</w:t>
-      </w:r>
-      <w:proofErr w:type="gramEnd"/>
-      <w:r>
-        <w:t>_to_pay_installments_</w:t>
-      </w:r>
-      <w:proofErr w:type="gramStart"/>
-      <w:r>
-        <w:t>period</w:t>
+        <w:t>agrees_to_pay_installments_period</w:t>
       </w:r>
       <w:proofErr w:type="spellEnd"/>
       <w:r>
-        <w:t xml:space="preserve"> }</w:t>
-      </w:r>
-      <w:proofErr w:type="gramEnd"/>
-      <w:r>
-        <w:t>}</w:t>
+        <w:t xml:space="preserve"> }}</w:t>
       </w:r>
       <w:r>
         <w:t xml:space="preserve"> in the amount of </w:t>
       </w:r>
-      <w:proofErr w:type="gramStart"/>
       <w:r>
         <w:t xml:space="preserve">{{ </w:t>
       </w:r>
       <w:proofErr w:type="spellStart"/>
       <w:r>
-        <w:t>agrees</w:t>
-      </w:r>
-      <w:proofErr w:type="gramEnd"/>
-      <w:r>
-        <w:t>_to_pay_installments_</w:t>
-      </w:r>
-      <w:proofErr w:type="gramStart"/>
-      <w:r>
-        <w:t>amount</w:t>
+        <w:t>agrees_to_pay_installments_amount</w:t>
       </w:r>
       <w:proofErr w:type="spellEnd"/>
       <w:r>
-        <w:t xml:space="preserve"> }</w:t>
-      </w:r>
-      <w:proofErr w:type="gramEnd"/>
-      <w:r>
-        <w:t xml:space="preserve">} </w:t>
+        <w:t xml:space="preserve"> }} </w:t>
       </w:r>
       <w:r>
         <w:t>starting on</w:t>
@@ -1170,19 +777,11 @@
       </w:r>
       <w:proofErr w:type="spellStart"/>
       <w:r>
-        <w:t>agrees_to_pay_installments_start_</w:t>
-      </w:r>
-      <w:proofErr w:type="gramStart"/>
-      <w:r>
-        <w:t>date</w:t>
+        <w:t>agrees_to_pay_installments_start_date</w:t>
       </w:r>
       <w:proofErr w:type="spellEnd"/>
       <w:r>
-        <w:t xml:space="preserve"> }</w:t>
-      </w:r>
-      <w:proofErr w:type="gramEnd"/>
-      <w:r>
-        <w:t>}</w:t>
+        <w:t xml:space="preserve"> }}</w:t>
       </w:r>
       <w:r>
         <w:t>.</w:t>
@@ -1337,25 +936,12 @@
       <w:r>
         <w:t>other_</w:t>
       </w:r>
-      <w:proofErr w:type="gramStart"/>
-      <w:r>
-        <w:t>reliefs.complete</w:t>
-      </w:r>
-      <w:proofErr w:type="gramEnd"/>
-      <w:r>
-        <w:t>_</w:t>
-      </w:r>
-      <w:proofErr w:type="gramStart"/>
-      <w:r>
-        <w:t>elements</w:t>
+      <w:r>
+        <w:t>reliefs.complete_elements</w:t>
       </w:r>
       <w:proofErr w:type="spellEnd"/>
       <w:r>
-        <w:t>(</w:t>
-      </w:r>
-      <w:proofErr w:type="gramEnd"/>
-      <w:r>
-        <w:t>) %}</w:t>
+        <w:t>() %}</w:t>
       </w:r>
     </w:p>
     <w:p>
@@ -1368,15 +954,7 @@
         <w:outlineLvl w:val="0"/>
       </w:pPr>
       <w:r>
-        <w:t xml:space="preserve">Defendant requests: </w:t>
-      </w:r>
-      <w:proofErr w:type="gramStart"/>
-      <w:r>
-        <w:t>{{ relief.name</w:t>
-      </w:r>
-      <w:proofErr w:type="gramEnd"/>
-      <w:r>
-        <w:t xml:space="preserve"> }}</w:t>
+        <w:t>Defendant requests: {{ relief.name }}</w:t>
       </w:r>
     </w:p>
     <w:p>
@@ -1429,11 +1007,7 @@
         <w:t>ch</w:t>
       </w:r>
       <w:r>
-        <w:t xml:space="preserve"> I will also file </w:t>
-      </w:r>
-      <w:r>
-        <w:lastRenderedPageBreak/>
-        <w:t>with the court to show</w:t>
+        <w:t xml:space="preserve"> I will also file with the court to show</w:t>
       </w:r>
       <w:r>
         <w:t xml:space="preserve"> I </w:t>
@@ -1553,18 +1127,16 @@
       </w:r>
       <w:proofErr w:type="spellEnd"/>
       <w:r>
-        <w:t>('include_signature.docx'</w:t>
-      </w:r>
-      <w:proofErr w:type="gramStart"/>
-      <w:r>
-        <w:t>) }</w:t>
-      </w:r>
-      <w:proofErr w:type="gramEnd"/>
-      <w:r>
-        <w:t>}</w:t>
+        <w:t>('include_signature.docx') }}</w:t>
       </w:r>
     </w:p>
     <w:sectPr>
+      <w:headerReference w:type="even" r:id="rId7"/>
+      <w:headerReference w:type="default" r:id="rId8"/>
+      <w:footerReference w:type="even" r:id="rId9"/>
+      <w:footerReference w:type="default" r:id="rId10"/>
+      <w:headerReference w:type="first" r:id="rId11"/>
+      <w:footerReference w:type="first" r:id="rId12"/>
       <w:type w:val="continuous"/>
       <w:pgSz w:w="12240" w:h="15840"/>
       <w:pgMar w:top="1440" w:right="1440" w:bottom="1440" w:left="1440" w:header="720" w:footer="720" w:gutter="0"/>
@@ -1576,7 +1148,7 @@
 </file>
 
 <file path=word/endnotes.xml><?xml version="1.0" encoding="utf-8"?>
-<w:endnotes xmlns:wpc="http://schemas.microsoft.com/office/word/2010/wordprocessingCanvas" xmlns:cx="http://schemas.microsoft.com/office/drawing/2014/chartex" xmlns:cx1="http://schemas.microsoft.com/office/drawing/2015/9/8/chartex" xmlns:cx2="http://schemas.microsoft.com/office/drawing/2015/10/21/chartex" xmlns:cx3="http://schemas.microsoft.com/office/drawing/2016/5/9/chartex" xmlns:cx4="http://schemas.microsoft.com/office/drawing/2016/5/10/chartex" xmlns:cx5="http://schemas.microsoft.com/office/drawing/2016/5/11/chartex" xmlns:cx6="http://schemas.microsoft.com/office/drawing/2016/5/12/chartex" xmlns:cx7="http://schemas.microsoft.com/office/drawing/2016/5/13/chartex" xmlns:cx8="http://schemas.microsoft.com/office/drawing/2016/5/14/chartex" xmlns:mc="http://schemas.openxmlformats.org/markup-compatibility/2006" xmlns:m="http://schemas.openxmlformats.org/officeDocument/2006/math" xmlns:aink="http://schemas.microsoft.com/office/drawing/2016/ink" xmlns:am3d="http://schemas.microsoft.com/office/drawing/2017/model3d" xmlns:oel="http://schemas.microsoft.com/office/2019/extlst" xmlns:r="http://schemas.openxmlformats.org/officeDocument/2006/relationships" xmlns:wp14="http://schemas.microsoft.com/office/word/2010/wordprocessingDrawing" xmlns:wp="http://schemas.openxmlformats.org/drawingml/2006/wordprocessingDrawing" xmlns:wpg="http://schemas.microsoft.com/office/word/2010/wordprocessingGroup" xmlns:wpi="http://schemas.microsoft.com/office/word/2010/wordprocessingInk" xmlns:wps="http://schemas.microsoft.com/office/word/2010/wordprocessingShape" xmlns:o="urn:schemas-microsoft-com:office:office" xmlns:v="urn:schemas-microsoft-com:vml" xmlns:w10="urn:schemas-microsoft-com:office:word" xmlns:w="http://schemas.openxmlformats.org/wordprocessingml/2006/main" xmlns:w14="http://schemas.microsoft.com/office/word/2010/wordml" xmlns:w15="http://schemas.microsoft.com/office/word/2012/wordml" xmlns:w16cex="http://schemas.microsoft.com/office/word/2018/wordml/cex" xmlns:w16cid="http://schemas.microsoft.com/office/word/2016/wordml/cid" xmlns:w16="http://schemas.microsoft.com/office/word/2018/wordml" xmlns:w16sdtdh="http://schemas.microsoft.com/office/word/2020/wordml/sdtdatahash" xmlns:w16sdtfl="http://schemas.microsoft.com/office/word/2024/wordml/sdtformatlock" xmlns:w16se="http://schemas.microsoft.com/office/word/2015/wordml/symex" xmlns:w16du="http://schemas.microsoft.com/office/word/2023/wordml/word16du" xmlns:wne="http://schemas.microsoft.com/office/word/2006/wordml" mc:Ignorable="w14 w15 w16se w16cid w16 w16cex w16sdtdh w16sdtfl w16du wp14">
+<w:endnotes xmlns:wpc="http://schemas.microsoft.com/office/word/2010/wordprocessingCanvas" xmlns:cx="http://schemas.microsoft.com/office/drawing/2014/chartex" xmlns:cx1="http://schemas.microsoft.com/office/drawing/2015/9/8/chartex" xmlns:cx2="http://schemas.microsoft.com/office/drawing/2015/10/21/chartex" xmlns:cx3="http://schemas.microsoft.com/office/drawing/2016/5/9/chartex" xmlns:cx4="http://schemas.microsoft.com/office/drawing/2016/5/10/chartex" xmlns:cx5="http://schemas.microsoft.com/office/drawing/2016/5/11/chartex" xmlns:cx6="http://schemas.microsoft.com/office/drawing/2016/5/12/chartex" xmlns:cx7="http://schemas.microsoft.com/office/drawing/2016/5/13/chartex" xmlns:cx8="http://schemas.microsoft.com/office/drawing/2016/5/14/chartex" xmlns:mc="http://schemas.openxmlformats.org/markup-compatibility/2006" xmlns:aink="http://schemas.microsoft.com/office/drawing/2016/ink" xmlns:am3d="http://schemas.microsoft.com/office/drawing/2017/model3d" xmlns:o="urn:schemas-microsoft-com:office:office" xmlns:oel="http://schemas.microsoft.com/office/2019/extlst" xmlns:r="http://schemas.openxmlformats.org/officeDocument/2006/relationships" xmlns:m="http://schemas.openxmlformats.org/officeDocument/2006/math" xmlns:v="urn:schemas-microsoft-com:vml" xmlns:wp14="http://schemas.microsoft.com/office/word/2010/wordprocessingDrawing" xmlns:wp="http://schemas.openxmlformats.org/drawingml/2006/wordprocessingDrawing" xmlns:w10="urn:schemas-microsoft-com:office:word" xmlns:w="http://schemas.openxmlformats.org/wordprocessingml/2006/main" xmlns:w14="http://schemas.microsoft.com/office/word/2010/wordml" xmlns:w15="http://schemas.microsoft.com/office/word/2012/wordml" xmlns:w16cex="http://schemas.microsoft.com/office/word/2018/wordml/cex" xmlns:w16cid="http://schemas.microsoft.com/office/word/2016/wordml/cid" xmlns:w16="http://schemas.microsoft.com/office/word/2018/wordml" xmlns:w16du="http://schemas.microsoft.com/office/word/2023/wordml/word16du" xmlns:w16sdtdh="http://schemas.microsoft.com/office/word/2020/wordml/sdtdatahash" xmlns:w16sdtfl="http://schemas.microsoft.com/office/word/2024/wordml/sdtformatlock" xmlns:w16se="http://schemas.microsoft.com/office/word/2015/wordml/symex" xmlns:wpg="http://schemas.microsoft.com/office/word/2010/wordprocessingGroup" xmlns:wpi="http://schemas.microsoft.com/office/word/2010/wordprocessingInk" xmlns:wne="http://schemas.microsoft.com/office/word/2006/wordml" xmlns:wps="http://schemas.microsoft.com/office/word/2010/wordprocessingShape" mc:Ignorable="w14 w15 w16se w16cid w16 w16cex w16sdtdh w16sdtfl w16du wp14">
   <w:endnote w:type="separator" w:id="-1">
     <w:p>
       <w:r>
@@ -1595,11 +1167,22 @@
 </file>
 
 <file path=word/footer1.xml><?xml version="1.0" encoding="utf-8"?>
-<w:ftr xmlns:wpc="http://schemas.microsoft.com/office/word/2010/wordprocessingCanvas" xmlns:cx="http://schemas.microsoft.com/office/drawing/2014/chartex" xmlns:cx1="http://schemas.microsoft.com/office/drawing/2015/9/8/chartex" xmlns:cx2="http://schemas.microsoft.com/office/drawing/2015/10/21/chartex" xmlns:cx3="http://schemas.microsoft.com/office/drawing/2016/5/9/chartex" xmlns:cx4="http://schemas.microsoft.com/office/drawing/2016/5/10/chartex" xmlns:cx5="http://schemas.microsoft.com/office/drawing/2016/5/11/chartex" xmlns:cx6="http://schemas.microsoft.com/office/drawing/2016/5/12/chartex" xmlns:cx7="http://schemas.microsoft.com/office/drawing/2016/5/13/chartex" xmlns:cx8="http://schemas.microsoft.com/office/drawing/2016/5/14/chartex" xmlns:mc="http://schemas.openxmlformats.org/markup-compatibility/2006" xmlns:m="http://schemas.openxmlformats.org/officeDocument/2006/math" xmlns:aink="http://schemas.microsoft.com/office/drawing/2016/ink" xmlns:am3d="http://schemas.microsoft.com/office/drawing/2017/model3d" xmlns:oel="http://schemas.microsoft.com/office/2019/extlst" xmlns:r="http://schemas.openxmlformats.org/officeDocument/2006/relationships" xmlns:wp14="http://schemas.microsoft.com/office/word/2010/wordprocessingDrawing" xmlns:wp="http://schemas.openxmlformats.org/drawingml/2006/wordprocessingDrawing" xmlns:wpg="http://schemas.microsoft.com/office/word/2010/wordprocessingGroup" xmlns:wpi="http://schemas.microsoft.com/office/word/2010/wordprocessingInk" xmlns:wps="http://schemas.microsoft.com/office/word/2010/wordprocessingShape" xmlns:o="urn:schemas-microsoft-com:office:office" xmlns:v="urn:schemas-microsoft-com:vml" xmlns:w10="urn:schemas-microsoft-com:office:word" xmlns:w="http://schemas.openxmlformats.org/wordprocessingml/2006/main" xmlns:w14="http://schemas.microsoft.com/office/word/2010/wordml" xmlns:w15="http://schemas.microsoft.com/office/word/2012/wordml" xmlns:w16cex="http://schemas.microsoft.com/office/word/2018/wordml/cex" xmlns:w16cid="http://schemas.microsoft.com/office/word/2016/wordml/cid" xmlns:w16="http://schemas.microsoft.com/office/word/2018/wordml" xmlns:w16sdtdh="http://schemas.microsoft.com/office/word/2020/wordml/sdtdatahash" xmlns:w16sdtfl="http://schemas.microsoft.com/office/word/2024/wordml/sdtformatlock" xmlns:w16se="http://schemas.microsoft.com/office/word/2015/wordml/symex" xmlns:w16du="http://schemas.microsoft.com/office/word/2023/wordml/word16du" xmlns:wne="http://schemas.microsoft.com/office/word/2006/wordml" mc:Ignorable="w14 w15 w16se w16cid w16 w16cex w16sdtdh w16sdtfl w16du wp14">
+<w:ftr xmlns:wpc="http://schemas.microsoft.com/office/word/2010/wordprocessingCanvas" xmlns:cx="http://schemas.microsoft.com/office/drawing/2014/chartex" xmlns:cx1="http://schemas.microsoft.com/office/drawing/2015/9/8/chartex" xmlns:cx2="http://schemas.microsoft.com/office/drawing/2015/10/21/chartex" xmlns:cx3="http://schemas.microsoft.com/office/drawing/2016/5/9/chartex" xmlns:cx4="http://schemas.microsoft.com/office/drawing/2016/5/10/chartex" xmlns:cx5="http://schemas.microsoft.com/office/drawing/2016/5/11/chartex" xmlns:cx6="http://schemas.microsoft.com/office/drawing/2016/5/12/chartex" xmlns:cx7="http://schemas.microsoft.com/office/drawing/2016/5/13/chartex" xmlns:cx8="http://schemas.microsoft.com/office/drawing/2016/5/14/chartex" xmlns:mc="http://schemas.openxmlformats.org/markup-compatibility/2006" xmlns:aink="http://schemas.microsoft.com/office/drawing/2016/ink" xmlns:am3d="http://schemas.microsoft.com/office/drawing/2017/model3d" xmlns:o="urn:schemas-microsoft-com:office:office" xmlns:oel="http://schemas.microsoft.com/office/2019/extlst" xmlns:r="http://schemas.openxmlformats.org/officeDocument/2006/relationships" xmlns:m="http://schemas.openxmlformats.org/officeDocument/2006/math" xmlns:v="urn:schemas-microsoft-com:vml" xmlns:wp14="http://schemas.microsoft.com/office/word/2010/wordprocessingDrawing" xmlns:wp="http://schemas.openxmlformats.org/drawingml/2006/wordprocessingDrawing" xmlns:w10="urn:schemas-microsoft-com:office:word" xmlns:w="http://schemas.openxmlformats.org/wordprocessingml/2006/main" xmlns:w14="http://schemas.microsoft.com/office/word/2010/wordml" xmlns:w15="http://schemas.microsoft.com/office/word/2012/wordml" xmlns:w16cex="http://schemas.microsoft.com/office/word/2018/wordml/cex" xmlns:w16cid="http://schemas.microsoft.com/office/word/2016/wordml/cid" xmlns:w16="http://schemas.microsoft.com/office/word/2018/wordml" xmlns:w16du="http://schemas.microsoft.com/office/word/2023/wordml/word16du" xmlns:w16sdtdh="http://schemas.microsoft.com/office/word/2020/wordml/sdtdatahash" xmlns:w16sdtfl="http://schemas.microsoft.com/office/word/2024/wordml/sdtformatlock" xmlns:w16se="http://schemas.microsoft.com/office/word/2015/wordml/symex" xmlns:wpg="http://schemas.microsoft.com/office/word/2010/wordprocessingGroup" xmlns:wpi="http://schemas.microsoft.com/office/word/2010/wordprocessingInk" xmlns:wne="http://schemas.microsoft.com/office/word/2006/wordml" xmlns:wps="http://schemas.microsoft.com/office/word/2010/wordprocessingShape" mc:Ignorable="w14 w15 w16se w16cid w16 w16cex w16sdtdh w16sdtfl w16du wp14">
   <w:p>
     <w:pPr>
       <w:pStyle w:val="Footer"/>
-      <w:ind w:left="6600" w:hanging="6600"/>
+    </w:pPr>
+  </w:p>
+</w:ftr>
+</file>
+
+<file path=word/footer2.xml><?xml version="1.0" encoding="utf-8"?>
+<w:ftr xmlns:wpc="http://schemas.microsoft.com/office/word/2010/wordprocessingCanvas" xmlns:cx="http://schemas.microsoft.com/office/drawing/2014/chartex" xmlns:cx1="http://schemas.microsoft.com/office/drawing/2015/9/8/chartex" xmlns:cx2="http://schemas.microsoft.com/office/drawing/2015/10/21/chartex" xmlns:cx3="http://schemas.microsoft.com/office/drawing/2016/5/9/chartex" xmlns:cx4="http://schemas.microsoft.com/office/drawing/2016/5/10/chartex" xmlns:cx5="http://schemas.microsoft.com/office/drawing/2016/5/11/chartex" xmlns:cx6="http://schemas.microsoft.com/office/drawing/2016/5/12/chartex" xmlns:cx7="http://schemas.microsoft.com/office/drawing/2016/5/13/chartex" xmlns:cx8="http://schemas.microsoft.com/office/drawing/2016/5/14/chartex" xmlns:mc="http://schemas.openxmlformats.org/markup-compatibility/2006" xmlns:aink="http://schemas.microsoft.com/office/drawing/2016/ink" xmlns:am3d="http://schemas.microsoft.com/office/drawing/2017/model3d" xmlns:o="urn:schemas-microsoft-com:office:office" xmlns:oel="http://schemas.microsoft.com/office/2019/extlst" xmlns:r="http://schemas.openxmlformats.org/officeDocument/2006/relationships" xmlns:m="http://schemas.openxmlformats.org/officeDocument/2006/math" xmlns:v="urn:schemas-microsoft-com:vml" xmlns:wp14="http://schemas.microsoft.com/office/word/2010/wordprocessingDrawing" xmlns:wp="http://schemas.openxmlformats.org/drawingml/2006/wordprocessingDrawing" xmlns:w10="urn:schemas-microsoft-com:office:word" xmlns:w="http://schemas.openxmlformats.org/wordprocessingml/2006/main" xmlns:w14="http://schemas.microsoft.com/office/word/2010/wordml" xmlns:w15="http://schemas.microsoft.com/office/word/2012/wordml" xmlns:w16cex="http://schemas.microsoft.com/office/word/2018/wordml/cex" xmlns:w16cid="http://schemas.microsoft.com/office/word/2016/wordml/cid" xmlns:w16="http://schemas.microsoft.com/office/word/2018/wordml" xmlns:w16du="http://schemas.microsoft.com/office/word/2023/wordml/word16du" xmlns:w16sdtdh="http://schemas.microsoft.com/office/word/2020/wordml/sdtdatahash" xmlns:w16sdtfl="http://schemas.microsoft.com/office/word/2024/wordml/sdtformatlock" xmlns:w16se="http://schemas.microsoft.com/office/word/2015/wordml/symex" xmlns:wpg="http://schemas.microsoft.com/office/word/2010/wordprocessingGroup" xmlns:wpi="http://schemas.microsoft.com/office/word/2010/wordprocessingInk" xmlns:wne="http://schemas.microsoft.com/office/word/2006/wordml" xmlns:wps="http://schemas.microsoft.com/office/word/2010/wordprocessingShape" mc:Ignorable="w14 w15 w16se w16cid w16 w16cex w16sdtdh w16sdtfl w16du wp14">
+  <w:p>
+    <w:pPr>
+      <w:pStyle w:val="Footer"/>
+      <w:ind w:left="6480" w:hanging="6480"/>
+      <w:jc w:val="right"/>
       <w:rPr>
         <w:rFonts w:cs="Times New Roman"/>
         <w:sz w:val="20"/>
@@ -1607,12 +1190,15 @@
       </w:rPr>
     </w:pPr>
     <w:r>
+      <w:ptab w:relativeTo="margin" w:alignment="center" w:leader="none"/>
+    </w:r>
+    <w:r>
       <w:rPr>
         <w:rFonts w:cs="Times New Roman"/>
         <w:sz w:val="20"/>
         <w:szCs w:val="20"/>
       </w:rPr>
-      <w:tab/>
+      <w:t xml:space="preserve">Page </w:t>
     </w:r>
     <w:r>
       <w:rPr>
@@ -1620,7 +1206,7 @@
         <w:sz w:val="20"/>
         <w:szCs w:val="20"/>
       </w:rPr>
-      <w:t xml:space="preserve">Page </w:t>
+      <w:fldChar w:fldCharType="begin"/>
     </w:r>
     <w:r>
       <w:rPr>
@@ -1628,6 +1214,46 @@
         <w:sz w:val="20"/>
         <w:szCs w:val="20"/>
       </w:rPr>
+      <w:instrText xml:space="preserve"> PAGE  \* Arabic  \* MERGEFORMAT </w:instrText>
+    </w:r>
+    <w:r>
+      <w:rPr>
+        <w:rFonts w:cs="Times New Roman"/>
+        <w:sz w:val="20"/>
+        <w:szCs w:val="20"/>
+      </w:rPr>
+      <w:fldChar w:fldCharType="separate"/>
+    </w:r>
+    <w:r>
+      <w:rPr>
+        <w:rFonts w:cs="Times New Roman"/>
+        <w:sz w:val="20"/>
+        <w:szCs w:val="20"/>
+      </w:rPr>
+      <w:t>1</w:t>
+    </w:r>
+    <w:r>
+      <w:rPr>
+        <w:rFonts w:cs="Times New Roman"/>
+        <w:sz w:val="20"/>
+        <w:szCs w:val="20"/>
+      </w:rPr>
+      <w:fldChar w:fldCharType="end"/>
+    </w:r>
+    <w:r>
+      <w:rPr>
+        <w:rFonts w:cs="Times New Roman"/>
+        <w:sz w:val="20"/>
+        <w:szCs w:val="20"/>
+      </w:rPr>
+      <w:t xml:space="preserve"> of </w:t>
+    </w:r>
+    <w:r>
+      <w:rPr>
+        <w:rFonts w:cs="Times New Roman"/>
+        <w:sz w:val="20"/>
+        <w:szCs w:val="20"/>
+      </w:rPr>
       <w:fldChar w:fldCharType="begin"/>
     </w:r>
     <w:r>
@@ -1636,7 +1262,7 @@
         <w:sz w:val="20"/>
         <w:szCs w:val="20"/>
       </w:rPr>
-      <w:instrText xml:space="preserve"> PAGE  \* Arabic  \* MERGEFORMAT </w:instrText>
+      <w:instrText xml:space="preserve"> NUMPAGES  \* Arabic  \* MERGEFORMAT </w:instrText>
     </w:r>
     <w:r>
       <w:rPr>
@@ -1649,11 +1275,10 @@
     <w:r>
       <w:rPr>
         <w:rFonts w:cs="Times New Roman"/>
-        <w:noProof/>
         <w:sz w:val="20"/>
         <w:szCs w:val="20"/>
       </w:rPr>
-      <w:t>2</w:t>
+      <w:t>3</w:t>
     </w:r>
     <w:r>
       <w:rPr>
@@ -1662,63 +1287,6 @@
         <w:szCs w:val="20"/>
       </w:rPr>
       <w:fldChar w:fldCharType="end"/>
-    </w:r>
-    <w:r>
-      <w:rPr>
-        <w:rFonts w:cs="Times New Roman"/>
-        <w:sz w:val="20"/>
-        <w:szCs w:val="20"/>
-      </w:rPr>
-      <w:t xml:space="preserve"> of </w:t>
-    </w:r>
-    <w:r>
-      <w:rPr>
-        <w:rFonts w:cs="Times New Roman"/>
-        <w:sz w:val="20"/>
-        <w:szCs w:val="20"/>
-      </w:rPr>
-      <w:fldChar w:fldCharType="begin"/>
-    </w:r>
-    <w:r>
-      <w:rPr>
-        <w:rFonts w:cs="Times New Roman"/>
-        <w:sz w:val="20"/>
-        <w:szCs w:val="20"/>
-      </w:rPr>
-      <w:instrText xml:space="preserve"> NUMPAGES  \* Arabic  \* MERGEFORMAT </w:instrText>
-    </w:r>
-    <w:r>
-      <w:rPr>
-        <w:rFonts w:cs="Times New Roman"/>
-        <w:sz w:val="20"/>
-        <w:szCs w:val="20"/>
-      </w:rPr>
-      <w:fldChar w:fldCharType="separate"/>
-    </w:r>
-    <w:r>
-      <w:rPr>
-        <w:rFonts w:cs="Times New Roman"/>
-        <w:noProof/>
-        <w:sz w:val="20"/>
-        <w:szCs w:val="20"/>
-      </w:rPr>
-      <w:t>2</w:t>
-    </w:r>
-    <w:r>
-      <w:rPr>
-        <w:rFonts w:cs="Times New Roman"/>
-        <w:sz w:val="20"/>
-        <w:szCs w:val="20"/>
-      </w:rPr>
-      <w:fldChar w:fldCharType="end"/>
-    </w:r>
-    <w:r>
-      <w:rPr>
-        <w:rFonts w:cs="Times New Roman"/>
-        <w:sz w:val="20"/>
-        <w:szCs w:val="20"/>
-      </w:rPr>
-      <w:tab/>
     </w:r>
     <w:r>
       <w:rPr>
@@ -1752,7 +1320,7 @@
         <w:sz w:val="20"/>
         <w:szCs w:val="20"/>
       </w:rPr>
-      <w:t xml:space="preserve"> tool</w:t>
+      <w:t xml:space="preserve"> </w:t>
     </w:r>
     <w:r>
       <w:rPr>
@@ -1760,6 +1328,14 @@
         <w:sz w:val="20"/>
         <w:szCs w:val="20"/>
       </w:rPr>
+      <w:t>tool</w:t>
+    </w:r>
+    <w:r>
+      <w:rPr>
+        <w:rFonts w:cs="Times New Roman"/>
+        <w:sz w:val="20"/>
+        <w:szCs w:val="20"/>
+      </w:rPr>
       <w:br/>
     </w:r>
     <w:r>
@@ -1771,6 +1347,11 @@
       <w:t>from Legal Services Vermont</w:t>
     </w:r>
   </w:p>
+</w:ftr>
+</file>
+
+<file path=word/footer3.xml><?xml version="1.0" encoding="utf-8"?>
+<w:ftr xmlns:wpc="http://schemas.microsoft.com/office/word/2010/wordprocessingCanvas" xmlns:cx="http://schemas.microsoft.com/office/drawing/2014/chartex" xmlns:cx1="http://schemas.microsoft.com/office/drawing/2015/9/8/chartex" xmlns:cx2="http://schemas.microsoft.com/office/drawing/2015/10/21/chartex" xmlns:cx3="http://schemas.microsoft.com/office/drawing/2016/5/9/chartex" xmlns:cx4="http://schemas.microsoft.com/office/drawing/2016/5/10/chartex" xmlns:cx5="http://schemas.microsoft.com/office/drawing/2016/5/11/chartex" xmlns:cx6="http://schemas.microsoft.com/office/drawing/2016/5/12/chartex" xmlns:cx7="http://schemas.microsoft.com/office/drawing/2016/5/13/chartex" xmlns:cx8="http://schemas.microsoft.com/office/drawing/2016/5/14/chartex" xmlns:mc="http://schemas.openxmlformats.org/markup-compatibility/2006" xmlns:aink="http://schemas.microsoft.com/office/drawing/2016/ink" xmlns:am3d="http://schemas.microsoft.com/office/drawing/2017/model3d" xmlns:o="urn:schemas-microsoft-com:office:office" xmlns:oel="http://schemas.microsoft.com/office/2019/extlst" xmlns:r="http://schemas.openxmlformats.org/officeDocument/2006/relationships" xmlns:m="http://schemas.openxmlformats.org/officeDocument/2006/math" xmlns:v="urn:schemas-microsoft-com:vml" xmlns:wp14="http://schemas.microsoft.com/office/word/2010/wordprocessingDrawing" xmlns:wp="http://schemas.openxmlformats.org/drawingml/2006/wordprocessingDrawing" xmlns:w10="urn:schemas-microsoft-com:office:word" xmlns:w="http://schemas.openxmlformats.org/wordprocessingml/2006/main" xmlns:w14="http://schemas.microsoft.com/office/word/2010/wordml" xmlns:w15="http://schemas.microsoft.com/office/word/2012/wordml" xmlns:w16cex="http://schemas.microsoft.com/office/word/2018/wordml/cex" xmlns:w16cid="http://schemas.microsoft.com/office/word/2016/wordml/cid" xmlns:w16="http://schemas.microsoft.com/office/word/2018/wordml" xmlns:w16du="http://schemas.microsoft.com/office/word/2023/wordml/word16du" xmlns:w16sdtdh="http://schemas.microsoft.com/office/word/2020/wordml/sdtdatahash" xmlns:w16sdtfl="http://schemas.microsoft.com/office/word/2024/wordml/sdtformatlock" xmlns:w16se="http://schemas.microsoft.com/office/word/2015/wordml/symex" xmlns:wpg="http://schemas.microsoft.com/office/word/2010/wordprocessingGroup" xmlns:wpi="http://schemas.microsoft.com/office/word/2010/wordprocessingInk" xmlns:wne="http://schemas.microsoft.com/office/word/2006/wordml" xmlns:wps="http://schemas.microsoft.com/office/word/2010/wordprocessingShape" mc:Ignorable="w14 w15 w16se w16cid w16 w16cex w16sdtdh w16sdtfl w16du wp14">
   <w:p>
     <w:pPr>
       <w:pStyle w:val="Footer"/>
@@ -1780,7 +1361,7 @@
 </file>
 
 <file path=word/footnotes.xml><?xml version="1.0" encoding="utf-8"?>
-<w:footnotes xmlns:wpc="http://schemas.microsoft.com/office/word/2010/wordprocessingCanvas" xmlns:cx="http://schemas.microsoft.com/office/drawing/2014/chartex" xmlns:cx1="http://schemas.microsoft.com/office/drawing/2015/9/8/chartex" xmlns:cx2="http://schemas.microsoft.com/office/drawing/2015/10/21/chartex" xmlns:cx3="http://schemas.microsoft.com/office/drawing/2016/5/9/chartex" xmlns:cx4="http://schemas.microsoft.com/office/drawing/2016/5/10/chartex" xmlns:cx5="http://schemas.microsoft.com/office/drawing/2016/5/11/chartex" xmlns:cx6="http://schemas.microsoft.com/office/drawing/2016/5/12/chartex" xmlns:cx7="http://schemas.microsoft.com/office/drawing/2016/5/13/chartex" xmlns:cx8="http://schemas.microsoft.com/office/drawing/2016/5/14/chartex" xmlns:mc="http://schemas.openxmlformats.org/markup-compatibility/2006" xmlns:m="http://schemas.openxmlformats.org/officeDocument/2006/math" xmlns:aink="http://schemas.microsoft.com/office/drawing/2016/ink" xmlns:am3d="http://schemas.microsoft.com/office/drawing/2017/model3d" xmlns:oel="http://schemas.microsoft.com/office/2019/extlst" xmlns:r="http://schemas.openxmlformats.org/officeDocument/2006/relationships" xmlns:wp14="http://schemas.microsoft.com/office/word/2010/wordprocessingDrawing" xmlns:wp="http://schemas.openxmlformats.org/drawingml/2006/wordprocessingDrawing" xmlns:wpg="http://schemas.microsoft.com/office/word/2010/wordprocessingGroup" xmlns:wpi="http://schemas.microsoft.com/office/word/2010/wordprocessingInk" xmlns:wps="http://schemas.microsoft.com/office/word/2010/wordprocessingShape" xmlns:o="urn:schemas-microsoft-com:office:office" xmlns:v="urn:schemas-microsoft-com:vml" xmlns:w10="urn:schemas-microsoft-com:office:word" xmlns:w="http://schemas.openxmlformats.org/wordprocessingml/2006/main" xmlns:w14="http://schemas.microsoft.com/office/word/2010/wordml" xmlns:w15="http://schemas.microsoft.com/office/word/2012/wordml" xmlns:w16cex="http://schemas.microsoft.com/office/word/2018/wordml/cex" xmlns:w16cid="http://schemas.microsoft.com/office/word/2016/wordml/cid" xmlns:w16="http://schemas.microsoft.com/office/word/2018/wordml" xmlns:w16sdtdh="http://schemas.microsoft.com/office/word/2020/wordml/sdtdatahash" xmlns:w16sdtfl="http://schemas.microsoft.com/office/word/2024/wordml/sdtformatlock" xmlns:w16se="http://schemas.microsoft.com/office/word/2015/wordml/symex" xmlns:w16du="http://schemas.microsoft.com/office/word/2023/wordml/word16du" xmlns:wne="http://schemas.microsoft.com/office/word/2006/wordml" mc:Ignorable="w14 w15 w16se w16cid w16 w16cex w16sdtdh w16sdtfl w16du wp14">
+<w:footnotes xmlns:wpc="http://schemas.microsoft.com/office/word/2010/wordprocessingCanvas" xmlns:cx="http://schemas.microsoft.com/office/drawing/2014/chartex" xmlns:cx1="http://schemas.microsoft.com/office/drawing/2015/9/8/chartex" xmlns:cx2="http://schemas.microsoft.com/office/drawing/2015/10/21/chartex" xmlns:cx3="http://schemas.microsoft.com/office/drawing/2016/5/9/chartex" xmlns:cx4="http://schemas.microsoft.com/office/drawing/2016/5/10/chartex" xmlns:cx5="http://schemas.microsoft.com/office/drawing/2016/5/11/chartex" xmlns:cx6="http://schemas.microsoft.com/office/drawing/2016/5/12/chartex" xmlns:cx7="http://schemas.microsoft.com/office/drawing/2016/5/13/chartex" xmlns:cx8="http://schemas.microsoft.com/office/drawing/2016/5/14/chartex" xmlns:mc="http://schemas.openxmlformats.org/markup-compatibility/2006" xmlns:aink="http://schemas.microsoft.com/office/drawing/2016/ink" xmlns:am3d="http://schemas.microsoft.com/office/drawing/2017/model3d" xmlns:o="urn:schemas-microsoft-com:office:office" xmlns:oel="http://schemas.microsoft.com/office/2019/extlst" xmlns:r="http://schemas.openxmlformats.org/officeDocument/2006/relationships" xmlns:m="http://schemas.openxmlformats.org/officeDocument/2006/math" xmlns:v="urn:schemas-microsoft-com:vml" xmlns:wp14="http://schemas.microsoft.com/office/word/2010/wordprocessingDrawing" xmlns:wp="http://schemas.openxmlformats.org/drawingml/2006/wordprocessingDrawing" xmlns:w10="urn:schemas-microsoft-com:office:word" xmlns:w="http://schemas.openxmlformats.org/wordprocessingml/2006/main" xmlns:w14="http://schemas.microsoft.com/office/word/2010/wordml" xmlns:w15="http://schemas.microsoft.com/office/word/2012/wordml" xmlns:w16cex="http://schemas.microsoft.com/office/word/2018/wordml/cex" xmlns:w16cid="http://schemas.microsoft.com/office/word/2016/wordml/cid" xmlns:w16="http://schemas.microsoft.com/office/word/2018/wordml" xmlns:w16du="http://schemas.microsoft.com/office/word/2023/wordml/word16du" xmlns:w16sdtdh="http://schemas.microsoft.com/office/word/2020/wordml/sdtdatahash" xmlns:w16sdtfl="http://schemas.microsoft.com/office/word/2024/wordml/sdtformatlock" xmlns:w16se="http://schemas.microsoft.com/office/word/2015/wordml/symex" xmlns:wpg="http://schemas.microsoft.com/office/word/2010/wordprocessingGroup" xmlns:wpi="http://schemas.microsoft.com/office/word/2010/wordprocessingInk" xmlns:wne="http://schemas.microsoft.com/office/word/2006/wordml" xmlns:wps="http://schemas.microsoft.com/office/word/2010/wordprocessingShape" mc:Ignorable="w14 w15 w16se w16cid w16 w16cex w16sdtdh w16sdtfl w16du wp14">
   <w:footnote w:type="separator" w:id="-1">
     <w:p>
       <w:r>
@@ -1798,8 +1379,38 @@
 </w:footnotes>
 </file>
 
+<file path=word/header1.xml><?xml version="1.0" encoding="utf-8"?>
+<w:hdr xmlns:wpc="http://schemas.microsoft.com/office/word/2010/wordprocessingCanvas" xmlns:cx="http://schemas.microsoft.com/office/drawing/2014/chartex" xmlns:cx1="http://schemas.microsoft.com/office/drawing/2015/9/8/chartex" xmlns:cx2="http://schemas.microsoft.com/office/drawing/2015/10/21/chartex" xmlns:cx3="http://schemas.microsoft.com/office/drawing/2016/5/9/chartex" xmlns:cx4="http://schemas.microsoft.com/office/drawing/2016/5/10/chartex" xmlns:cx5="http://schemas.microsoft.com/office/drawing/2016/5/11/chartex" xmlns:cx6="http://schemas.microsoft.com/office/drawing/2016/5/12/chartex" xmlns:cx7="http://schemas.microsoft.com/office/drawing/2016/5/13/chartex" xmlns:cx8="http://schemas.microsoft.com/office/drawing/2016/5/14/chartex" xmlns:mc="http://schemas.openxmlformats.org/markup-compatibility/2006" xmlns:aink="http://schemas.microsoft.com/office/drawing/2016/ink" xmlns:am3d="http://schemas.microsoft.com/office/drawing/2017/model3d" xmlns:o="urn:schemas-microsoft-com:office:office" xmlns:oel="http://schemas.microsoft.com/office/2019/extlst" xmlns:r="http://schemas.openxmlformats.org/officeDocument/2006/relationships" xmlns:m="http://schemas.openxmlformats.org/officeDocument/2006/math" xmlns:v="urn:schemas-microsoft-com:vml" xmlns:wp14="http://schemas.microsoft.com/office/word/2010/wordprocessingDrawing" xmlns:wp="http://schemas.openxmlformats.org/drawingml/2006/wordprocessingDrawing" xmlns:w10="urn:schemas-microsoft-com:office:word" xmlns:w="http://schemas.openxmlformats.org/wordprocessingml/2006/main" xmlns:w14="http://schemas.microsoft.com/office/word/2010/wordml" xmlns:w15="http://schemas.microsoft.com/office/word/2012/wordml" xmlns:w16cex="http://schemas.microsoft.com/office/word/2018/wordml/cex" xmlns:w16cid="http://schemas.microsoft.com/office/word/2016/wordml/cid" xmlns:w16="http://schemas.microsoft.com/office/word/2018/wordml" xmlns:w16du="http://schemas.microsoft.com/office/word/2023/wordml/word16du" xmlns:w16sdtdh="http://schemas.microsoft.com/office/word/2020/wordml/sdtdatahash" xmlns:w16sdtfl="http://schemas.microsoft.com/office/word/2024/wordml/sdtformatlock" xmlns:w16se="http://schemas.microsoft.com/office/word/2015/wordml/symex" xmlns:wpg="http://schemas.microsoft.com/office/word/2010/wordprocessingGroup" xmlns:wpi="http://schemas.microsoft.com/office/word/2010/wordprocessingInk" xmlns:wne="http://schemas.microsoft.com/office/word/2006/wordml" xmlns:wps="http://schemas.microsoft.com/office/word/2010/wordprocessingShape" mc:Ignorable="w14 w15 w16se w16cid w16 w16cex w16sdtdh w16sdtfl w16du wp14">
+  <w:p>
+    <w:pPr>
+      <w:pStyle w:val="Header"/>
+    </w:pPr>
+  </w:p>
+</w:hdr>
+</file>
+
+<file path=word/header2.xml><?xml version="1.0" encoding="utf-8"?>
+<w:hdr xmlns:wpc="http://schemas.microsoft.com/office/word/2010/wordprocessingCanvas" xmlns:cx="http://schemas.microsoft.com/office/drawing/2014/chartex" xmlns:cx1="http://schemas.microsoft.com/office/drawing/2015/9/8/chartex" xmlns:cx2="http://schemas.microsoft.com/office/drawing/2015/10/21/chartex" xmlns:cx3="http://schemas.microsoft.com/office/drawing/2016/5/9/chartex" xmlns:cx4="http://schemas.microsoft.com/office/drawing/2016/5/10/chartex" xmlns:cx5="http://schemas.microsoft.com/office/drawing/2016/5/11/chartex" xmlns:cx6="http://schemas.microsoft.com/office/drawing/2016/5/12/chartex" xmlns:cx7="http://schemas.microsoft.com/office/drawing/2016/5/13/chartex" xmlns:cx8="http://schemas.microsoft.com/office/drawing/2016/5/14/chartex" xmlns:mc="http://schemas.openxmlformats.org/markup-compatibility/2006" xmlns:aink="http://schemas.microsoft.com/office/drawing/2016/ink" xmlns:am3d="http://schemas.microsoft.com/office/drawing/2017/model3d" xmlns:o="urn:schemas-microsoft-com:office:office" xmlns:oel="http://schemas.microsoft.com/office/2019/extlst" xmlns:r="http://schemas.openxmlformats.org/officeDocument/2006/relationships" xmlns:m="http://schemas.openxmlformats.org/officeDocument/2006/math" xmlns:v="urn:schemas-microsoft-com:vml" xmlns:wp14="http://schemas.microsoft.com/office/word/2010/wordprocessingDrawing" xmlns:wp="http://schemas.openxmlformats.org/drawingml/2006/wordprocessingDrawing" xmlns:w10="urn:schemas-microsoft-com:office:word" xmlns:w="http://schemas.openxmlformats.org/wordprocessingml/2006/main" xmlns:w14="http://schemas.microsoft.com/office/word/2010/wordml" xmlns:w15="http://schemas.microsoft.com/office/word/2012/wordml" xmlns:w16cex="http://schemas.microsoft.com/office/word/2018/wordml/cex" xmlns:w16cid="http://schemas.microsoft.com/office/word/2016/wordml/cid" xmlns:w16="http://schemas.microsoft.com/office/word/2018/wordml" xmlns:w16du="http://schemas.microsoft.com/office/word/2023/wordml/word16du" xmlns:w16sdtdh="http://schemas.microsoft.com/office/word/2020/wordml/sdtdatahash" xmlns:w16sdtfl="http://schemas.microsoft.com/office/word/2024/wordml/sdtformatlock" xmlns:w16se="http://schemas.microsoft.com/office/word/2015/wordml/symex" xmlns:wpg="http://schemas.microsoft.com/office/word/2010/wordprocessingGroup" xmlns:wpi="http://schemas.microsoft.com/office/word/2010/wordprocessingInk" xmlns:wne="http://schemas.microsoft.com/office/word/2006/wordml" xmlns:wps="http://schemas.microsoft.com/office/word/2010/wordprocessingShape" mc:Ignorable="w14 w15 w16se w16cid w16 w16cex w16sdtdh w16sdtfl w16du wp14">
+  <w:p>
+    <w:pPr>
+      <w:pStyle w:val="Header"/>
+    </w:pPr>
+  </w:p>
+</w:hdr>
+</file>
+
+<file path=word/header3.xml><?xml version="1.0" encoding="utf-8"?>
+<w:hdr xmlns:wpc="http://schemas.microsoft.com/office/word/2010/wordprocessingCanvas" xmlns:cx="http://schemas.microsoft.com/office/drawing/2014/chartex" xmlns:cx1="http://schemas.microsoft.com/office/drawing/2015/9/8/chartex" xmlns:cx2="http://schemas.microsoft.com/office/drawing/2015/10/21/chartex" xmlns:cx3="http://schemas.microsoft.com/office/drawing/2016/5/9/chartex" xmlns:cx4="http://schemas.microsoft.com/office/drawing/2016/5/10/chartex" xmlns:cx5="http://schemas.microsoft.com/office/drawing/2016/5/11/chartex" xmlns:cx6="http://schemas.microsoft.com/office/drawing/2016/5/12/chartex" xmlns:cx7="http://schemas.microsoft.com/office/drawing/2016/5/13/chartex" xmlns:cx8="http://schemas.microsoft.com/office/drawing/2016/5/14/chartex" xmlns:mc="http://schemas.openxmlformats.org/markup-compatibility/2006" xmlns:aink="http://schemas.microsoft.com/office/drawing/2016/ink" xmlns:am3d="http://schemas.microsoft.com/office/drawing/2017/model3d" xmlns:o="urn:schemas-microsoft-com:office:office" xmlns:oel="http://schemas.microsoft.com/office/2019/extlst" xmlns:r="http://schemas.openxmlformats.org/officeDocument/2006/relationships" xmlns:m="http://schemas.openxmlformats.org/officeDocument/2006/math" xmlns:v="urn:schemas-microsoft-com:vml" xmlns:wp14="http://schemas.microsoft.com/office/word/2010/wordprocessingDrawing" xmlns:wp="http://schemas.openxmlformats.org/drawingml/2006/wordprocessingDrawing" xmlns:w10="urn:schemas-microsoft-com:office:word" xmlns:w="http://schemas.openxmlformats.org/wordprocessingml/2006/main" xmlns:w14="http://schemas.microsoft.com/office/word/2010/wordml" xmlns:w15="http://schemas.microsoft.com/office/word/2012/wordml" xmlns:w16cex="http://schemas.microsoft.com/office/word/2018/wordml/cex" xmlns:w16cid="http://schemas.microsoft.com/office/word/2016/wordml/cid" xmlns:w16="http://schemas.microsoft.com/office/word/2018/wordml" xmlns:w16du="http://schemas.microsoft.com/office/word/2023/wordml/word16du" xmlns:w16sdtdh="http://schemas.microsoft.com/office/word/2020/wordml/sdtdatahash" xmlns:w16sdtfl="http://schemas.microsoft.com/office/word/2024/wordml/sdtformatlock" xmlns:w16se="http://schemas.microsoft.com/office/word/2015/wordml/symex" xmlns:wpg="http://schemas.microsoft.com/office/word/2010/wordprocessingGroup" xmlns:wpi="http://schemas.microsoft.com/office/word/2010/wordprocessingInk" xmlns:wne="http://schemas.microsoft.com/office/word/2006/wordml" xmlns:wps="http://schemas.microsoft.com/office/word/2010/wordprocessingShape" mc:Ignorable="w14 w15 w16se w16cid w16 w16cex w16sdtdh w16sdtfl w16du wp14">
+  <w:p>
+    <w:pPr>
+      <w:pStyle w:val="Header"/>
+    </w:pPr>
+  </w:p>
+</w:hdr>
+</file>
+
 <file path=word/numbering.xml><?xml version="1.0" encoding="utf-8"?>
-<w:numbering xmlns:wpc="http://schemas.microsoft.com/office/word/2010/wordprocessingCanvas" xmlns:cx="http://schemas.microsoft.com/office/drawing/2014/chartex" xmlns:cx1="http://schemas.microsoft.com/office/drawing/2015/9/8/chartex" xmlns:cx2="http://schemas.microsoft.com/office/drawing/2015/10/21/chartex" xmlns:cx3="http://schemas.microsoft.com/office/drawing/2016/5/9/chartex" xmlns:cx4="http://schemas.microsoft.com/office/drawing/2016/5/10/chartex" xmlns:cx5="http://schemas.microsoft.com/office/drawing/2016/5/11/chartex" xmlns:cx6="http://schemas.microsoft.com/office/drawing/2016/5/12/chartex" xmlns:cx7="http://schemas.microsoft.com/office/drawing/2016/5/13/chartex" xmlns:cx8="http://schemas.microsoft.com/office/drawing/2016/5/14/chartex" xmlns:mc="http://schemas.openxmlformats.org/markup-compatibility/2006" xmlns:m="http://schemas.openxmlformats.org/officeDocument/2006/math" xmlns:aink="http://schemas.microsoft.com/office/drawing/2016/ink" xmlns:am3d="http://schemas.microsoft.com/office/drawing/2017/model3d" xmlns:oel="http://schemas.microsoft.com/office/2019/extlst" xmlns:r="http://schemas.openxmlformats.org/officeDocument/2006/relationships" xmlns:wp14="http://schemas.microsoft.com/office/word/2010/wordprocessingDrawing" xmlns:wp="http://schemas.openxmlformats.org/drawingml/2006/wordprocessingDrawing" xmlns:wpg="http://schemas.microsoft.com/office/word/2010/wordprocessingGroup" xmlns:wpi="http://schemas.microsoft.com/office/word/2010/wordprocessingInk" xmlns:wps="http://schemas.microsoft.com/office/word/2010/wordprocessingShape" xmlns:o="urn:schemas-microsoft-com:office:office" xmlns:v="urn:schemas-microsoft-com:vml" xmlns:w10="urn:schemas-microsoft-com:office:word" xmlns:w="http://schemas.openxmlformats.org/wordprocessingml/2006/main" xmlns:w14="http://schemas.microsoft.com/office/word/2010/wordml" xmlns:w15="http://schemas.microsoft.com/office/word/2012/wordml" xmlns:w16cex="http://schemas.microsoft.com/office/word/2018/wordml/cex" xmlns:w16cid="http://schemas.microsoft.com/office/word/2016/wordml/cid" xmlns:w16="http://schemas.microsoft.com/office/word/2018/wordml" xmlns:w16sdtdh="http://schemas.microsoft.com/office/word/2020/wordml/sdtdatahash" xmlns:w16sdtfl="http://schemas.microsoft.com/office/word/2024/wordml/sdtformatlock" xmlns:w16se="http://schemas.microsoft.com/office/word/2015/wordml/symex" xmlns:w16du="http://schemas.microsoft.com/office/word/2023/wordml/word16du" xmlns:wne="http://schemas.microsoft.com/office/word/2006/wordml" mc:Ignorable="w14 w15 w16se w16cid w16 w16cex w16sdtdh w16sdtfl w16du wp14">
+<w:numbering xmlns:wpc="http://schemas.microsoft.com/office/word/2010/wordprocessingCanvas" xmlns:cx="http://schemas.microsoft.com/office/drawing/2014/chartex" xmlns:cx1="http://schemas.microsoft.com/office/drawing/2015/9/8/chartex" xmlns:cx2="http://schemas.microsoft.com/office/drawing/2015/10/21/chartex" xmlns:cx3="http://schemas.microsoft.com/office/drawing/2016/5/9/chartex" xmlns:cx4="http://schemas.microsoft.com/office/drawing/2016/5/10/chartex" xmlns:cx5="http://schemas.microsoft.com/office/drawing/2016/5/11/chartex" xmlns:cx6="http://schemas.microsoft.com/office/drawing/2016/5/12/chartex" xmlns:cx7="http://schemas.microsoft.com/office/drawing/2016/5/13/chartex" xmlns:cx8="http://schemas.microsoft.com/office/drawing/2016/5/14/chartex" xmlns:mc="http://schemas.openxmlformats.org/markup-compatibility/2006" xmlns:aink="http://schemas.microsoft.com/office/drawing/2016/ink" xmlns:am3d="http://schemas.microsoft.com/office/drawing/2017/model3d" xmlns:o="urn:schemas-microsoft-com:office:office" xmlns:oel="http://schemas.microsoft.com/office/2019/extlst" xmlns:r="http://schemas.openxmlformats.org/officeDocument/2006/relationships" xmlns:m="http://schemas.openxmlformats.org/officeDocument/2006/math" xmlns:v="urn:schemas-microsoft-com:vml" xmlns:wp14="http://schemas.microsoft.com/office/word/2010/wordprocessingDrawing" xmlns:wp="http://schemas.openxmlformats.org/drawingml/2006/wordprocessingDrawing" xmlns:w10="urn:schemas-microsoft-com:office:word" xmlns:w="http://schemas.openxmlformats.org/wordprocessingml/2006/main" xmlns:w14="http://schemas.microsoft.com/office/word/2010/wordml" xmlns:w15="http://schemas.microsoft.com/office/word/2012/wordml" xmlns:w16cex="http://schemas.microsoft.com/office/word/2018/wordml/cex" xmlns:w16cid="http://schemas.microsoft.com/office/word/2016/wordml/cid" xmlns:w16="http://schemas.microsoft.com/office/word/2018/wordml" xmlns:w16du="http://schemas.microsoft.com/office/word/2023/wordml/word16du" xmlns:w16sdtdh="http://schemas.microsoft.com/office/word/2020/wordml/sdtdatahash" xmlns:w16sdtfl="http://schemas.microsoft.com/office/word/2024/wordml/sdtformatlock" xmlns:w16se="http://schemas.microsoft.com/office/word/2015/wordml/symex" xmlns:wpg="http://schemas.microsoft.com/office/word/2010/wordprocessingGroup" xmlns:wpi="http://schemas.microsoft.com/office/word/2010/wordprocessingInk" xmlns:wne="http://schemas.microsoft.com/office/word/2006/wordml" xmlns:wps="http://schemas.microsoft.com/office/word/2010/wordprocessingShape" mc:Ignorable="w14 w15 w16se w16cid w16 w16cex w16sdtdh w16sdtfl w16du wp14">
   <w:abstractNum w:abstractNumId="0" w15:restartNumberingAfterBreak="0">
     <w:nsid w:val="25BA49ED"/>
     <w:multiLevelType w:val="hybridMultilevel"/>
@@ -3120,7 +2731,7 @@
 </file>
 
 <file path=word/styles.xml><?xml version="1.0" encoding="utf-8"?>
-<w:styles xmlns:mc="http://schemas.openxmlformats.org/markup-compatibility/2006" xmlns:r="http://schemas.openxmlformats.org/officeDocument/2006/relationships" xmlns:w="http://schemas.openxmlformats.org/wordprocessingml/2006/main" xmlns:w14="http://schemas.microsoft.com/office/word/2010/wordml" xmlns:w15="http://schemas.microsoft.com/office/word/2012/wordml" xmlns:w16cex="http://schemas.microsoft.com/office/word/2018/wordml/cex" xmlns:w16cid="http://schemas.microsoft.com/office/word/2016/wordml/cid" xmlns:w16="http://schemas.microsoft.com/office/word/2018/wordml" xmlns:w16sdtdh="http://schemas.microsoft.com/office/word/2020/wordml/sdtdatahash" xmlns:w16sdtfl="http://schemas.microsoft.com/office/word/2024/wordml/sdtformatlock" xmlns:w16se="http://schemas.microsoft.com/office/word/2015/wordml/symex" xmlns:w16du="http://schemas.microsoft.com/office/word/2023/wordml/word16du" mc:Ignorable="w14 w15 w16se w16cid w16 w16cex w16sdtdh w16sdtfl w16du">
+<w:styles xmlns:mc="http://schemas.openxmlformats.org/markup-compatibility/2006" xmlns:r="http://schemas.openxmlformats.org/officeDocument/2006/relationships" xmlns:w="http://schemas.openxmlformats.org/wordprocessingml/2006/main" xmlns:w14="http://schemas.microsoft.com/office/word/2010/wordml" xmlns:w15="http://schemas.microsoft.com/office/word/2012/wordml" xmlns:w16cex="http://schemas.microsoft.com/office/word/2018/wordml/cex" xmlns:w16cid="http://schemas.microsoft.com/office/word/2016/wordml/cid" xmlns:w16="http://schemas.microsoft.com/office/word/2018/wordml" xmlns:w16du="http://schemas.microsoft.com/office/word/2023/wordml/word16du" xmlns:w16sdtdh="http://schemas.microsoft.com/office/word/2020/wordml/sdtdatahash" xmlns:w16sdtfl="http://schemas.microsoft.com/office/word/2024/wordml/sdtformatlock" xmlns:w16se="http://schemas.microsoft.com/office/word/2015/wordml/symex" mc:Ignorable="w14 w15 w16se w16cid w16 w16cex w16sdtdh w16sdtfl w16du">
   <w:docDefaults>
     <w:rPrDefault>
       <w:rPr>

</xml_diff>

<commit_message>
updated the main template: added missing payment option and formatted currency
</commit_message>
<xml_diff>
--- a/docassemble/VTSuperiorCourtDebtAnswer/data/templates/superior_court_debt_answer.docx
+++ b/docassemble/VTSuperiorCourtDebtAnswer/data/templates/superior_court_debt_answer.docx
@@ -710,21 +710,29 @@
     </w:p>
     <w:p>
       <w:pPr>
-        <w:keepNext/>
-        <w:keepLines/>
-        <w:rPr>
-          <w:rFonts w:cs="Times New Roman"/>
-          <w:bCs/>
-          <w:szCs w:val="24"/>
-        </w:rPr>
-      </w:pPr>
-      <w:r>
-        <w:rPr>
-          <w:rFonts w:cs="Times New Roman"/>
-          <w:bCs/>
-          <w:szCs w:val="24"/>
-        </w:rPr>
-        <w:t>{%p else %}</w:t>
+        <w:pStyle w:val="BodyText"/>
+      </w:pPr>
+      <w:r>
+        <w:t xml:space="preserve">{%p </w:t>
+      </w:r>
+      <w:proofErr w:type="spellStart"/>
+      <w:r>
+        <w:t>el</w:t>
+      </w:r>
+      <w:r>
+        <w:t>if</w:t>
+      </w:r>
+      <w:proofErr w:type="spellEnd"/>
+      <w:r>
+        <w:t xml:space="preserve"> payment == "</w:t>
+      </w:r>
+      <w:proofErr w:type="spellStart"/>
+      <w:r>
+        <w:t>agrees_to_pay_other</w:t>
+      </w:r>
+      <w:proofErr w:type="spellEnd"/>
+      <w:r>
+        <w:t>" %}</w:t>
       </w:r>
     </w:p>
     <w:p>
@@ -736,55 +744,21 @@
         </w:numPr>
       </w:pPr>
       <w:r>
-        <w:t>Defendant wishes</w:t>
-      </w:r>
-      <w:r>
-        <w:t xml:space="preserve"> to make installment payments every </w:t>
-      </w:r>
-      <w:r>
-        <w:t xml:space="preserve">{{ </w:t>
+        <w:t xml:space="preserve">Defendant wishes to pay the debt in </w:t>
+      </w:r>
+      <w:r>
+        <w:t>this way:</w:t>
+      </w:r>
+      <w:r>
+        <w:t xml:space="preserve"> {{ </w:t>
       </w:r>
       <w:proofErr w:type="spellStart"/>
       <w:r>
-        <w:t>agrees_to_pay_installments_period</w:t>
+        <w:t>agrees_to_pay_other_description</w:t>
       </w:r>
       <w:proofErr w:type="spellEnd"/>
       <w:r>
-        <w:t xml:space="preserve"> }}</w:t>
-      </w:r>
-      <w:r>
-        <w:t xml:space="preserve"> in the amount of </w:t>
-      </w:r>
-      <w:r>
-        <w:t xml:space="preserve">{{ </w:t>
-      </w:r>
-      <w:proofErr w:type="spellStart"/>
-      <w:r>
-        <w:t>agrees_to_pay_installments_amount</w:t>
-      </w:r>
-      <w:proofErr w:type="spellEnd"/>
-      <w:r>
-        <w:t xml:space="preserve"> }} </w:t>
-      </w:r>
-      <w:r>
-        <w:t>starting on</w:t>
-      </w:r>
-      <w:r>
-        <w:t xml:space="preserve"> </w:t>
-      </w:r>
-      <w:r>
-        <w:t>{{</w:t>
-      </w:r>
-      <w:proofErr w:type="spellStart"/>
-      <w:r>
-        <w:t>agrees_to_pay_installments_start_date</w:t>
-      </w:r>
-      <w:proofErr w:type="spellEnd"/>
-      <w:r>
-        <w:t xml:space="preserve"> }}</w:t>
-      </w:r>
-      <w:r>
-        <w:t>.</w:t>
+        <w:t xml:space="preserve"> }}.</w:t>
       </w:r>
     </w:p>
     <w:p>
@@ -803,7 +777,79 @@
           <w:bCs/>
           <w:szCs w:val="24"/>
         </w:rPr>
-        <w:t>{%p endif %}</w:t>
+        <w:t>{%p else %}</w:t>
+      </w:r>
+    </w:p>
+    <w:p>
+      <w:pPr>
+        <w:pStyle w:val="BodyText"/>
+        <w:numPr>
+          <w:ilvl w:val="0"/>
+          <w:numId w:val="4"/>
+        </w:numPr>
+      </w:pPr>
+      <w:r>
+        <w:t>Defendant wishes</w:t>
+      </w:r>
+      <w:r>
+        <w:t xml:space="preserve"> to make installment payments every </w:t>
+      </w:r>
+      <w:r>
+        <w:t xml:space="preserve">{{ </w:t>
+      </w:r>
+      <w:proofErr w:type="spellStart"/>
+      <w:r>
+        <w:t>agrees_to_pay_installments_period</w:t>
+      </w:r>
+      <w:proofErr w:type="spellEnd"/>
+      <w:r>
+        <w:t xml:space="preserve"> }}</w:t>
+      </w:r>
+      <w:r>
+        <w:t xml:space="preserve"> in the amount of </w:t>
+      </w:r>
+      <w:r>
+        <w:t xml:space="preserve">{{ </w:t>
+      </w:r>
+      <w:r>
+        <w:t>"$%.2f"</w:t>
+      </w:r>
+      <w:r>
+        <w:t>|</w:t>
+      </w:r>
+      <w:r>
+        <w:t>format(</w:t>
+      </w:r>
+      <w:proofErr w:type="spellStart"/>
+      <w:r>
+        <w:t>agrees_to_pay_installments_amount</w:t>
+      </w:r>
+      <w:proofErr w:type="spellEnd"/>
+      <w:r>
+        <w:t>)</w:t>
+      </w:r>
+      <w:r>
+        <w:t xml:space="preserve"> }} </w:t>
+      </w:r>
+      <w:r>
+        <w:t>starting on</w:t>
+      </w:r>
+      <w:r>
+        <w:t xml:space="preserve"> </w:t>
+      </w:r>
+      <w:r>
+        <w:t>{{</w:t>
+      </w:r>
+      <w:proofErr w:type="spellStart"/>
+      <w:r>
+        <w:t>agrees_to_pay_installments_start_date</w:t>
+      </w:r>
+      <w:proofErr w:type="spellEnd"/>
+      <w:r>
+        <w:t xml:space="preserve"> }}</w:t>
+      </w:r>
+      <w:r>
+        <w:t>.</w:t>
       </w:r>
     </w:p>
     <w:p>
@@ -827,10 +873,38 @@
     </w:p>
     <w:p>
       <w:pPr>
-        <w:pStyle w:val="BodyText"/>
-      </w:pPr>
-      <w:r>
-        <w:t xml:space="preserve">{%p if </w:t>
+        <w:keepNext/>
+        <w:keepLines/>
+        <w:rPr>
+          <w:rFonts w:cs="Times New Roman"/>
+          <w:bCs/>
+          <w:szCs w:val="24"/>
+        </w:rPr>
+      </w:pPr>
+      <w:r>
+        <w:rPr>
+          <w:rFonts w:cs="Times New Roman"/>
+          <w:bCs/>
+          <w:szCs w:val="24"/>
+        </w:rPr>
+        <w:t>{%p endif %}</w:t>
+      </w:r>
+    </w:p>
+    <w:p>
+      <w:pPr>
+        <w:pStyle w:val="BodyText"/>
+      </w:pPr>
+      <w:r>
+        <w:t>{%p if</w:t>
+      </w:r>
+      <w:r>
+        <w:t xml:space="preserve"> not </w:t>
+      </w:r>
+      <w:r>
+        <w:t xml:space="preserve">defined("payment") </w:t>
+      </w:r>
+      <w:r>
+        <w:t xml:space="preserve">and </w:t>
       </w:r>
       <w:proofErr w:type="spellStart"/>
       <w:r>
@@ -992,7 +1066,11 @@
         <w:t>ing</w:t>
       </w:r>
       <w:r>
-        <w:t xml:space="preserve"> a copy of this Answer (and any attachments) to every party in the case (Plaintiffs and Defendants)</w:t>
+        <w:t xml:space="preserve"> a copy of this Answer (and any attachments) to every party in the case </w:t>
+      </w:r>
+      <w:r>
+        <w:lastRenderedPageBreak/>
+        <w:t>(Plaintiffs and Defendants)</w:t>
       </w:r>
       <w:r>
         <w:t xml:space="preserve">. This includes </w:t>
@@ -3414,6 +3492,34 @@
       <w:lang w:bidi="en-US"/>
     </w:rPr>
   </w:style>
+  <w:style w:type="paragraph" w:styleId="HTMLPreformatted">
+    <w:name w:val="HTML Preformatted"/>
+    <w:basedOn w:val="Normal"/>
+    <w:link w:val="HTMLPreformattedChar"/>
+    <w:uiPriority w:val="99"/>
+    <w:semiHidden/>
+    <w:unhideWhenUsed/>
+    <w:rsid w:val="002445C4"/>
+    <w:rPr>
+      <w:rFonts w:ascii="Consolas" w:hAnsi="Consolas"/>
+      <w:sz w:val="20"/>
+      <w:szCs w:val="20"/>
+    </w:rPr>
+  </w:style>
+  <w:style w:type="character" w:customStyle="1" w:styleId="HTMLPreformattedChar">
+    <w:name w:val="HTML Preformatted Char"/>
+    <w:basedOn w:val="DefaultParagraphFont"/>
+    <w:link w:val="HTMLPreformatted"/>
+    <w:uiPriority w:val="99"/>
+    <w:semiHidden/>
+    <w:rsid w:val="002445C4"/>
+    <w:rPr>
+      <w:rFonts w:ascii="Consolas" w:eastAsia="Calibri" w:hAnsi="Consolas" w:cs="Calibri"/>
+      <w:sz w:val="20"/>
+      <w:szCs w:val="20"/>
+      <w:lang w:bidi="en-US"/>
+    </w:rPr>
+  </w:style>
 </w:styles>
 </file>
 

</xml_diff>

<commit_message>
updated code to enable superior_court_debt_counterclaim_attachment; updated interview order for counterclaims
</commit_message>
<xml_diff>
--- a/docassemble/VTSuperiorCourtDebtAnswer/data/templates/superior_court_debt_answer.docx
+++ b/docassemble/VTSuperiorCourtDebtAnswer/data/templates/superior_court_debt_answer.docx
@@ -25,39 +25,7 @@
           <w:rFonts w:eastAsia="Times New Roman" w:cs="Times New Roman"/>
           <w:szCs w:val="24"/>
         </w:rPr>
-        <w:t xml:space="preserve">{{p </w:t>
-      </w:r>
-      <w:proofErr w:type="spellStart"/>
-      <w:r>
-        <w:rPr>
-          <w:rFonts w:eastAsia="Times New Roman" w:cs="Times New Roman"/>
-          <w:szCs w:val="24"/>
-        </w:rPr>
-        <w:t>include_docx_template</w:t>
-      </w:r>
-      <w:proofErr w:type="spellEnd"/>
-      <w:r>
-        <w:rPr>
-          <w:rFonts w:eastAsia="Times New Roman" w:cs="Times New Roman"/>
-          <w:szCs w:val="24"/>
-        </w:rPr>
-        <w:t xml:space="preserve">('include_caption.docx', </w:t>
-      </w:r>
-      <w:proofErr w:type="spellStart"/>
-      <w:r>
-        <w:rPr>
-          <w:rFonts w:eastAsia="Times New Roman" w:cs="Times New Roman"/>
-          <w:szCs w:val="24"/>
-        </w:rPr>
-        <w:t>caption_title</w:t>
-      </w:r>
-      <w:proofErr w:type="spellEnd"/>
-      <w:r>
-        <w:rPr>
-          <w:rFonts w:eastAsia="Times New Roman" w:cs="Times New Roman"/>
-          <w:szCs w:val="24"/>
-        </w:rPr>
-        <w:t>=</w:t>
+        <w:t>{{p include_docx_template('include_caption.docx', caption_title=</w:t>
       </w:r>
       <w:r>
         <w:rPr>
@@ -194,15 +162,7 @@
         <w:pStyle w:val="BodyText"/>
       </w:pPr>
       <w:r>
-        <w:t xml:space="preserve">{%p for response in </w:t>
-      </w:r>
-      <w:proofErr w:type="spellStart"/>
-      <w:r>
-        <w:t>allegation_answers.complete_elements</w:t>
-      </w:r>
-      <w:proofErr w:type="spellEnd"/>
-      <w:r>
-        <w:t>() %}</w:t>
+        <w:t>{%p for response in allegation_answers.complete_elements() %}</w:t>
       </w:r>
     </w:p>
     <w:p>
@@ -214,199 +174,15 @@
           <w:b/>
           <w:bCs/>
         </w:rPr>
-        <w:t xml:space="preserve">Paragraph {{ </w:t>
-      </w:r>
-      <w:proofErr w:type="spellStart"/>
-      <w:r>
-        <w:rPr>
-          <w:b/>
-          <w:bCs/>
-        </w:rPr>
-        <w:t>loop.index</w:t>
-      </w:r>
-      <w:proofErr w:type="spellEnd"/>
-      <w:r>
-        <w:rPr>
-          <w:b/>
-          <w:bCs/>
-        </w:rPr>
-        <w:t xml:space="preserve"> }}:{% if </w:t>
-      </w:r>
-      <w:proofErr w:type="spellStart"/>
-      <w:r>
-        <w:rPr>
-          <w:b/>
-          <w:bCs/>
-        </w:rPr>
-        <w:t>response.choice</w:t>
-      </w:r>
-      <w:proofErr w:type="spellEnd"/>
-      <w:r>
-        <w:rPr>
-          <w:b/>
-          <w:bCs/>
-        </w:rPr>
-        <w:t xml:space="preserve"> == "agree" %} I agree.{% endif %}{% if </w:t>
-      </w:r>
-      <w:proofErr w:type="spellStart"/>
-      <w:r>
-        <w:rPr>
-          <w:b/>
-          <w:bCs/>
-        </w:rPr>
-        <w:t>response.choice</w:t>
-      </w:r>
-      <w:proofErr w:type="spellEnd"/>
-      <w:r>
-        <w:rPr>
-          <w:b/>
-          <w:bCs/>
-        </w:rPr>
-        <w:t xml:space="preserve"> == "disagree" %} I disagree. {{ </w:t>
-      </w:r>
-      <w:proofErr w:type="spellStart"/>
-      <w:r>
-        <w:rPr>
-          <w:b/>
-          <w:bCs/>
-        </w:rPr>
-        <w:t>response.explanation</w:t>
-      </w:r>
-      <w:proofErr w:type="spellEnd"/>
-      <w:r>
-        <w:rPr>
-          <w:b/>
-          <w:bCs/>
-        </w:rPr>
-        <w:t xml:space="preserve"> }}{% endif %}{% if </w:t>
-      </w:r>
-      <w:proofErr w:type="spellStart"/>
-      <w:r>
-        <w:rPr>
-          <w:b/>
-          <w:bCs/>
-        </w:rPr>
-        <w:t>response.choice</w:t>
-      </w:r>
-      <w:proofErr w:type="spellEnd"/>
-      <w:r>
-        <w:rPr>
-          <w:b/>
-          <w:bCs/>
-        </w:rPr>
-        <w:t xml:space="preserve"> == "</w:t>
-      </w:r>
-      <w:proofErr w:type="spellStart"/>
-      <w:r>
-        <w:rPr>
-          <w:b/>
-          <w:bCs/>
-        </w:rPr>
-        <w:t>agree_disagree</w:t>
-      </w:r>
-      <w:proofErr w:type="spellEnd"/>
-      <w:r>
-        <w:rPr>
-          <w:b/>
-          <w:bCs/>
-        </w:rPr>
-        <w:t xml:space="preserve">" %} I agree with part and disagree with part. {{ </w:t>
-      </w:r>
-      <w:proofErr w:type="spellStart"/>
-      <w:r>
-        <w:rPr>
-          <w:b/>
-          <w:bCs/>
-        </w:rPr>
-        <w:t>response.explanation</w:t>
-      </w:r>
-      <w:proofErr w:type="spellEnd"/>
-      <w:r>
-        <w:rPr>
-          <w:b/>
-          <w:bCs/>
-        </w:rPr>
-        <w:t xml:space="preserve"> }}{% endif %}{% if </w:t>
-      </w:r>
-      <w:proofErr w:type="spellStart"/>
-      <w:r>
-        <w:rPr>
-          <w:b/>
-          <w:bCs/>
-        </w:rPr>
-        <w:t>response.choice</w:t>
-      </w:r>
-      <w:proofErr w:type="spellEnd"/>
-      <w:r>
-        <w:rPr>
-          <w:b/>
-          <w:bCs/>
-        </w:rPr>
-        <w:t xml:space="preserve"> == "</w:t>
-      </w:r>
-      <w:proofErr w:type="spellStart"/>
-      <w:r>
-        <w:rPr>
-          <w:b/>
-          <w:bCs/>
-        </w:rPr>
-        <w:t>dont_know</w:t>
-      </w:r>
-      <w:proofErr w:type="spellEnd"/>
-      <w:r>
-        <w:rPr>
-          <w:b/>
-          <w:bCs/>
-        </w:rPr>
-        <w:t xml:space="preserve">" %} I don't know if this is true.{% endif %}{% if </w:t>
-      </w:r>
-      <w:proofErr w:type="spellStart"/>
-      <w:r>
-        <w:rPr>
-          <w:b/>
-          <w:bCs/>
-        </w:rPr>
-        <w:t>response.choice</w:t>
-      </w:r>
-      <w:proofErr w:type="spellEnd"/>
-      <w:r>
-        <w:rPr>
-          <w:b/>
-          <w:bCs/>
-        </w:rPr>
-        <w:t xml:space="preserve"> == "</w:t>
-      </w:r>
-      <w:proofErr w:type="spellStart"/>
-      <w:r>
-        <w:rPr>
-          <w:b/>
-          <w:bCs/>
-        </w:rPr>
-        <w:t>response_not_required</w:t>
-      </w:r>
-      <w:proofErr w:type="spellEnd"/>
-      <w:r>
-        <w:rPr>
-          <w:b/>
-          <w:bCs/>
-        </w:rPr>
-        <w:t>" %} No response required.{% endif %}</w:t>
-      </w:r>
-    </w:p>
-    <w:p>
-      <w:pPr>
-        <w:pStyle w:val="BodyText"/>
-      </w:pPr>
-      <w:r>
-        <w:t xml:space="preserve">{%p </w:t>
-      </w:r>
-      <w:proofErr w:type="spellStart"/>
-      <w:r>
-        <w:t>endfor</w:t>
-      </w:r>
-      <w:proofErr w:type="spellEnd"/>
-      <w:r>
-        <w:t xml:space="preserve"> %}</w:t>
+        <w:t>Paragraph {{ loop.index }}:{% if response.choice == "agree" %} I agree.{% endif %}{% if response.choice == "disagree" %} I disagree. {{ response.explanation }}{% endif %}{% if response.choice == "agree_disagree" %} I agree with part and disagree with part. {{ response.explanation }}{% endif %}{% if response.choice == "dont_know" %} I don't know if this is true.{% endif %}{% if response.choice == "response_not_required" %} No response required.{% endif %}</w:t>
+      </w:r>
+    </w:p>
+    <w:p>
+      <w:pPr>
+        <w:pStyle w:val="BodyText"/>
+      </w:pPr>
+      <w:r>
+        <w:t>{%p endfor %}</w:t>
       </w:r>
     </w:p>
     <w:p>
@@ -416,13 +192,8 @@
       <w:r>
         <w:t xml:space="preserve">{%p if </w:t>
       </w:r>
-      <w:proofErr w:type="spellStart"/>
-      <w:r>
-        <w:t>defenses.true_values</w:t>
-      </w:r>
-      <w:proofErr w:type="spellEnd"/>
-      <w:r>
-        <w:t xml:space="preserve">() | length &gt; 0 </w:t>
+      <w:r>
+        <w:t xml:space="preserve">defenses.true_values() | length &gt; 0 </w:t>
       </w:r>
       <w:r>
         <w:t>%}</w:t>
@@ -475,13 +246,8 @@
       <w:r>
         <w:t xml:space="preserve">{%p for defense in </w:t>
       </w:r>
-      <w:proofErr w:type="spellStart"/>
-      <w:r>
-        <w:t>defenses.true_values</w:t>
-      </w:r>
-      <w:proofErr w:type="spellEnd"/>
-      <w:r>
-        <w:t>()</w:t>
+      <w:r>
+        <w:t>defenses.true_values()</w:t>
       </w:r>
       <w:r>
         <w:t xml:space="preserve"> %}</w:t>
@@ -497,15 +263,7 @@
         <w:outlineLvl w:val="0"/>
       </w:pPr>
       <w:r>
-        <w:t xml:space="preserve">{{ </w:t>
-      </w:r>
-      <w:proofErr w:type="spellStart"/>
-      <w:r>
-        <w:t>defenses_terms</w:t>
-      </w:r>
-      <w:proofErr w:type="spellEnd"/>
-      <w:r>
-        <w:t>[defense] }}</w:t>
+        <w:t>{{ defenses_terms[defense] }}</w:t>
       </w:r>
     </w:p>
     <w:p>
@@ -518,15 +276,7 @@
         <w:outlineLvl w:val="0"/>
       </w:pPr>
       <w:r>
-        <w:t xml:space="preserve">{%p </w:t>
-      </w:r>
-      <w:proofErr w:type="spellStart"/>
-      <w:r>
-        <w:t>endfor</w:t>
-      </w:r>
-      <w:proofErr w:type="spellEnd"/>
-      <w:r>
-        <w:t xml:space="preserve"> %}</w:t>
+        <w:t>{%p endfor %}</w:t>
       </w:r>
     </w:p>
     <w:p>
@@ -549,15 +299,7 @@
         <w:t>p</w:t>
       </w:r>
       <w:r>
-        <w:t xml:space="preserve"> if defined("</w:t>
-      </w:r>
-      <w:proofErr w:type="spellStart"/>
-      <w:r>
-        <w:t>disagrees_additional_explanation</w:t>
-      </w:r>
-      <w:proofErr w:type="spellEnd"/>
-      <w:r>
-        <w:t>")</w:t>
+        <w:t xml:space="preserve"> if defined("disagrees_additional_explanation")</w:t>
       </w:r>
       <w:r>
         <w:t xml:space="preserve"> %}</w:t>
@@ -677,15 +419,7 @@
         <w:t xml:space="preserve"> </w:t>
       </w:r>
       <w:r>
-        <w:t>if payment == "</w:t>
-      </w:r>
-      <w:proofErr w:type="spellStart"/>
-      <w:r>
-        <w:t>agrees_to_pay_in_full</w:t>
-      </w:r>
-      <w:proofErr w:type="spellEnd"/>
-      <w:r>
-        <w:t>" %}</w:t>
+        <w:t>if payment == "agrees_to_pay_in_full" %}</w:t>
       </w:r>
     </w:p>
     <w:p>
@@ -697,15 +431,7 @@
         </w:numPr>
       </w:pPr>
       <w:r>
-        <w:t xml:space="preserve">Defendant wishes to pay the debt in full by {{ </w:t>
-      </w:r>
-      <w:proofErr w:type="spellStart"/>
-      <w:r>
-        <w:t>pay_in_full_date</w:t>
-      </w:r>
-      <w:proofErr w:type="spellEnd"/>
-      <w:r>
-        <w:t xml:space="preserve"> }}.</w:t>
+        <w:t>Defendant wishes to pay the debt in full by {{ pay_in_full_date }}.</w:t>
       </w:r>
     </w:p>
     <w:p>
@@ -715,22 +441,15 @@
       <w:r>
         <w:t xml:space="preserve">{%p </w:t>
       </w:r>
-      <w:proofErr w:type="spellStart"/>
       <w:r>
         <w:t>el</w:t>
       </w:r>
       <w:r>
-        <w:t>if</w:t>
-      </w:r>
-      <w:proofErr w:type="spellEnd"/>
-      <w:r>
-        <w:t xml:space="preserve"> payment == "</w:t>
-      </w:r>
-      <w:proofErr w:type="spellStart"/>
+        <w:t>if payment == "</w:t>
+      </w:r>
       <w:r>
         <w:t>agrees_to_pay_other</w:t>
       </w:r>
-      <w:proofErr w:type="spellEnd"/>
       <w:r>
         <w:t>" %}</w:t>
       </w:r>
@@ -752,11 +471,9 @@
       <w:r>
         <w:t xml:space="preserve"> {{ </w:t>
       </w:r>
-      <w:proofErr w:type="spellStart"/>
       <w:r>
         <w:t>agrees_to_pay_other_description</w:t>
       </w:r>
-      <w:proofErr w:type="spellEnd"/>
       <w:r>
         <w:t xml:space="preserve"> }}.</w:t>
       </w:r>
@@ -795,22 +512,20 @@
         <w:t xml:space="preserve"> to make installment payments every </w:t>
       </w:r>
       <w:r>
+        <w:t>{{ agrees_to_pay_installments_period</w:t>
+      </w:r>
+      <w:r>
+        <w:t xml:space="preserve"> | lower</w:t>
+      </w:r>
+      <w:r>
+        <w:t xml:space="preserve"> }}</w:t>
+      </w:r>
+      <w:r>
+        <w:t xml:space="preserve"> in the amount of </w:t>
+      </w:r>
+      <w:r>
         <w:t xml:space="preserve">{{ </w:t>
       </w:r>
-      <w:proofErr w:type="spellStart"/>
-      <w:r>
-        <w:t>agrees_to_pay_installments_period</w:t>
-      </w:r>
-      <w:proofErr w:type="spellEnd"/>
-      <w:r>
-        <w:t xml:space="preserve"> }}</w:t>
-      </w:r>
-      <w:r>
-        <w:t xml:space="preserve"> in the amount of </w:t>
-      </w:r>
-      <w:r>
-        <w:t xml:space="preserve">{{ </w:t>
-      </w:r>
       <w:r>
         <w:t>"$%.2f"</w:t>
       </w:r>
@@ -820,11 +535,9 @@
       <w:r>
         <w:t>format(</w:t>
       </w:r>
-      <w:proofErr w:type="spellStart"/>
       <w:r>
         <w:t>agrees_to_pay_installments_amount</w:t>
       </w:r>
-      <w:proofErr w:type="spellEnd"/>
       <w:r>
         <w:t>)</w:t>
       </w:r>
@@ -838,15 +551,7 @@
         <w:t xml:space="preserve"> </w:t>
       </w:r>
       <w:r>
-        <w:t>{{</w:t>
-      </w:r>
-      <w:proofErr w:type="spellStart"/>
-      <w:r>
-        <w:t>agrees_to_pay_installments_start_date</w:t>
-      </w:r>
-      <w:proofErr w:type="spellEnd"/>
-      <w:r>
-        <w:t xml:space="preserve"> }}</w:t>
+        <w:t>{{agrees_to_pay_installments_start_date }}</w:t>
       </w:r>
       <w:r>
         <w:t>.</w:t>
@@ -906,13 +611,8 @@
       <w:r>
         <w:t xml:space="preserve">and </w:t>
       </w:r>
-      <w:proofErr w:type="spellStart"/>
-      <w:r>
-        <w:t>any_allegation_disputed</w:t>
-      </w:r>
-      <w:proofErr w:type="spellEnd"/>
-      <w:r>
-        <w:t xml:space="preserve"> %}</w:t>
+      <w:r>
+        <w:t>any_allegation_disputed %}</w:t>
       </w:r>
     </w:p>
     <w:p>
@@ -957,15 +657,7 @@
         <w:t xml:space="preserve"> </w:t>
       </w:r>
       <w:r>
-        <w:t xml:space="preserve">if </w:t>
-      </w:r>
-      <w:proofErr w:type="spellStart"/>
-      <w:r>
-        <w:t>wants_to_file_counterclaim</w:t>
-      </w:r>
-      <w:proofErr w:type="spellEnd"/>
-      <w:r>
-        <w:t xml:space="preserve"> %}</w:t>
+        <w:t>if wants_to_file_counterclaim %}</w:t>
       </w:r>
     </w:p>
     <w:p>
@@ -1006,16 +698,11 @@
       <w:r>
         <w:t xml:space="preserve">{%p for relief in </w:t>
       </w:r>
-      <w:proofErr w:type="spellStart"/>
       <w:r>
         <w:t>other_</w:t>
       </w:r>
       <w:r>
-        <w:t>reliefs.complete_elements</w:t>
-      </w:r>
-      <w:proofErr w:type="spellEnd"/>
-      <w:r>
-        <w:t>() %}</w:t>
+        <w:t>reliefs.complete_elements() %}</w:t>
       </w:r>
     </w:p>
     <w:p>
@@ -1036,15 +723,7 @@
         <w:pStyle w:val="BodyText"/>
       </w:pPr>
       <w:r>
-        <w:t xml:space="preserve">{%p </w:t>
-      </w:r>
-      <w:proofErr w:type="spellStart"/>
-      <w:r>
-        <w:t>endfor</w:t>
-      </w:r>
-      <w:proofErr w:type="spellEnd"/>
-      <w:r>
-        <w:t xml:space="preserve"> %}</w:t>
+        <w:t>{%p endfor %}</w:t>
       </w:r>
     </w:p>
     <w:p>
@@ -1197,15 +876,7 @@
         <w:pStyle w:val="BodyText"/>
       </w:pPr>
       <w:r>
-        <w:t xml:space="preserve">{{p </w:t>
-      </w:r>
-      <w:proofErr w:type="spellStart"/>
-      <w:r>
-        <w:t>include_docx_template</w:t>
-      </w:r>
-      <w:proofErr w:type="spellEnd"/>
-      <w:r>
-        <w:t>('include_signature.docx') }}</w:t>
+        <w:t>{{p include_docx_template('include_signature.docx') }}</w:t>
       </w:r>
     </w:p>
     <w:sectPr>
@@ -1380,18 +1051,8 @@
         <w:sz w:val="20"/>
         <w:szCs w:val="20"/>
       </w:rPr>
-      <w:t xml:space="preserve">Prepared with </w:t>
+      <w:t>Prepared with VTCourtForms</w:t>
     </w:r>
-    <w:proofErr w:type="spellStart"/>
-    <w:r>
-      <w:rPr>
-        <w:rFonts w:cs="Times New Roman"/>
-        <w:sz w:val="20"/>
-        <w:szCs w:val="20"/>
-      </w:rPr>
-      <w:t>VTCourtForms</w:t>
-    </w:r>
-    <w:proofErr w:type="spellEnd"/>
     <w:r>
       <w:rPr>
         <w:rFonts w:cs="Times New Roman"/>

</xml_diff>